<commit_message>
kolejny skuces polskiej policji
</commit_message>
<xml_diff>
--- a/z6-pwiisi-5-1.docx
+++ b/z6-pwiisi-5-1.docx
@@ -51,7 +51,7 @@
                     </pic:cNvPicPr>
                   </pic:nvPicPr>
                   <pic:blipFill>
-                    <a:blip r:embed="rId6">
+                    <a:blip r:embed="rId8">
                       <a:extLst>
                         <a:ext uri="{28A0092B-C50C-407E-A947-70E740481C1C}">
                           <a14:useLocalDpi xmlns:a14="http://schemas.microsoft.com/office/drawing/2010/main" val="0"/>
@@ -161,107 +161,7 @@
           <w:sz w:val="32"/>
           <w:szCs w:val="32"/>
         </w:rPr>
-        <w:t xml:space="preserve">Interior </w:t>
-      </w:r>
-      <w:proofErr w:type="spellStart"/>
-      <w:r>
-        <w:rPr>
-          <w:rFonts w:ascii="Arial" w:hAnsi="Arial" w:cs="Arial"/>
-          <w:i/>
-          <w:sz w:val="32"/>
-          <w:szCs w:val="32"/>
-        </w:rPr>
-        <w:t>decoration</w:t>
-      </w:r>
-      <w:proofErr w:type="spellEnd"/>
-      <w:r>
-        <w:rPr>
-          <w:rFonts w:ascii="Arial" w:hAnsi="Arial" w:cs="Arial"/>
-          <w:i/>
-          <w:sz w:val="32"/>
-          <w:szCs w:val="32"/>
-        </w:rPr>
-        <w:t xml:space="preserve"> system </w:t>
-      </w:r>
-      <w:proofErr w:type="spellStart"/>
-      <w:r>
-        <w:rPr>
-          <w:rFonts w:ascii="Arial" w:hAnsi="Arial" w:cs="Arial"/>
-          <w:i/>
-          <w:sz w:val="32"/>
-          <w:szCs w:val="32"/>
-        </w:rPr>
-        <w:t>using</w:t>
-      </w:r>
-      <w:proofErr w:type="spellEnd"/>
-      <w:r>
-        <w:rPr>
-          <w:rFonts w:ascii="Arial" w:hAnsi="Arial" w:cs="Arial"/>
-          <w:i/>
-          <w:sz w:val="32"/>
-          <w:szCs w:val="32"/>
-        </w:rPr>
-        <w:t xml:space="preserve"> </w:t>
-      </w:r>
-      <w:proofErr w:type="spellStart"/>
-      <w:r>
-        <w:rPr>
-          <w:rFonts w:ascii="Arial" w:hAnsi="Arial" w:cs="Arial"/>
-          <w:i/>
-          <w:sz w:val="32"/>
-          <w:szCs w:val="32"/>
-        </w:rPr>
-        <w:t>virtual</w:t>
-      </w:r>
-      <w:proofErr w:type="spellEnd"/>
-      <w:r>
-        <w:rPr>
-          <w:rFonts w:ascii="Arial" w:hAnsi="Arial" w:cs="Arial"/>
-          <w:i/>
-          <w:sz w:val="32"/>
-          <w:szCs w:val="32"/>
-        </w:rPr>
-        <w:t xml:space="preserve"> </w:t>
-      </w:r>
-      <w:proofErr w:type="spellStart"/>
-      <w:r>
-        <w:rPr>
-          <w:rFonts w:ascii="Arial" w:hAnsi="Arial" w:cs="Arial"/>
-          <w:i/>
-          <w:sz w:val="32"/>
-          <w:szCs w:val="32"/>
-        </w:rPr>
-        <w:t>reality</w:t>
-      </w:r>
-      <w:proofErr w:type="spellEnd"/>
-      <w:r>
-        <w:rPr>
-          <w:rFonts w:ascii="Arial" w:hAnsi="Arial" w:cs="Arial"/>
-          <w:i/>
-          <w:sz w:val="32"/>
-          <w:szCs w:val="32"/>
-        </w:rPr>
-        <w:t xml:space="preserve"> </w:t>
-      </w:r>
-      <w:proofErr w:type="spellStart"/>
-      <w:r>
-        <w:rPr>
-          <w:rFonts w:ascii="Arial" w:hAnsi="Arial" w:cs="Arial"/>
-          <w:i/>
-          <w:sz w:val="32"/>
-          <w:szCs w:val="32"/>
-        </w:rPr>
-        <w:t>technology</w:t>
-      </w:r>
-      <w:proofErr w:type="spellEnd"/>
-      <w:r>
-        <w:rPr>
-          <w:rFonts w:ascii="Arial" w:hAnsi="Arial" w:cs="Arial"/>
-          <w:i/>
-          <w:sz w:val="32"/>
-          <w:szCs w:val="32"/>
-        </w:rPr>
-        <w:t xml:space="preserve"> (VR)</w:t>
+        <w:t>Interior decoration system using virtual reality technology (VR)</w:t>
       </w:r>
     </w:p>
     <w:p>
@@ -290,115 +190,105 @@
           <w:sz w:val="28"/>
           <w:szCs w:val="28"/>
         </w:rPr>
-        <w:t xml:space="preserve">Andrzej </w:t>
-      </w:r>
-      <w:proofErr w:type="spellStart"/>
-      <w:r>
+        <w:t>Andrzej Paruch</w:t>
+      </w:r>
+    </w:p>
+    <w:p>
+      <w:pPr>
+        <w:spacing w:after="0" w:line="360" w:lineRule="auto"/>
+        <w:ind w:left="4139"/>
+        <w:rPr>
+          <w:rFonts w:ascii="Arial" w:hAnsi="Arial" w:cs="Arial"/>
+        </w:rPr>
+      </w:pPr>
+      <w:r>
+        <w:rPr>
+          <w:rFonts w:ascii="Arial" w:hAnsi="Arial" w:cs="Arial"/>
+        </w:rPr>
+        <w:t>Nr albumu:</w:t>
+      </w:r>
+      <w:r>
+        <w:rPr>
+          <w:rFonts w:ascii="Arial" w:hAnsi="Arial" w:cs="Arial"/>
+        </w:rPr>
+        <w:t xml:space="preserve"> 136606</w:t>
+      </w:r>
+    </w:p>
+    <w:p>
+      <w:pPr>
+        <w:spacing w:after="0" w:line="360" w:lineRule="auto"/>
+        <w:ind w:left="4139"/>
+        <w:rPr>
+          <w:rFonts w:ascii="Arial" w:hAnsi="Arial" w:cs="Arial"/>
+        </w:rPr>
+      </w:pPr>
+      <w:r>
+        <w:rPr>
+          <w:rFonts w:ascii="Arial" w:hAnsi="Arial" w:cs="Arial"/>
+        </w:rPr>
+        <w:t>Kierunek:</w:t>
+      </w:r>
+      <w:r>
+        <w:rPr>
+          <w:rFonts w:ascii="Arial" w:hAnsi="Arial" w:cs="Arial"/>
+        </w:rPr>
+        <w:t xml:space="preserve"> Informatyka</w:t>
+      </w:r>
+    </w:p>
+    <w:p>
+      <w:pPr>
+        <w:spacing w:after="0" w:line="360" w:lineRule="auto"/>
+        <w:ind w:left="4139"/>
+        <w:rPr>
+          <w:rFonts w:ascii="Arial" w:hAnsi="Arial" w:cs="Arial"/>
+        </w:rPr>
+      </w:pPr>
+      <w:r>
+        <w:rPr>
+          <w:rFonts w:ascii="Arial" w:hAnsi="Arial" w:cs="Arial"/>
+        </w:rPr>
+        <w:t>Forma studiów: stacjonarne</w:t>
+      </w:r>
+    </w:p>
+    <w:p>
+      <w:pPr>
+        <w:spacing w:after="0" w:line="360" w:lineRule="auto"/>
+        <w:ind w:left="4139"/>
+        <w:rPr>
+          <w:rFonts w:ascii="Arial" w:hAnsi="Arial" w:cs="Arial"/>
+        </w:rPr>
+      </w:pPr>
+      <w:r>
+        <w:rPr>
+          <w:rFonts w:ascii="Arial" w:hAnsi="Arial" w:cs="Arial"/>
+        </w:rPr>
+        <w:t>Poziom studiów: I</w:t>
+      </w:r>
+    </w:p>
+    <w:p>
+      <w:pPr>
+        <w:spacing w:after="120" w:line="360" w:lineRule="auto"/>
+        <w:ind w:left="4139"/>
         <w:rPr>
           <w:rFonts w:ascii="Arial" w:hAnsi="Arial" w:cs="Arial"/>
           <w:sz w:val="28"/>
           <w:szCs w:val="28"/>
         </w:rPr>
-        <w:t>Paruch</w:t>
-      </w:r>
-      <w:proofErr w:type="spellEnd"/>
-    </w:p>
-    <w:p>
-      <w:pPr>
-        <w:spacing w:after="0" w:line="360" w:lineRule="auto"/>
-        <w:ind w:left="4139"/>
-        <w:rPr>
-          <w:rFonts w:ascii="Arial" w:hAnsi="Arial" w:cs="Arial"/>
-        </w:rPr>
-      </w:pPr>
-      <w:r>
-        <w:rPr>
-          <w:rFonts w:ascii="Arial" w:hAnsi="Arial" w:cs="Arial"/>
-        </w:rPr>
-        <w:t>Nr albumu:</w:t>
-      </w:r>
-      <w:r>
-        <w:rPr>
-          <w:rFonts w:ascii="Arial" w:hAnsi="Arial" w:cs="Arial"/>
-        </w:rPr>
-        <w:t xml:space="preserve"> 136606</w:t>
-      </w:r>
-    </w:p>
-    <w:p>
-      <w:pPr>
-        <w:spacing w:after="0" w:line="360" w:lineRule="auto"/>
-        <w:ind w:left="4139"/>
-        <w:rPr>
-          <w:rFonts w:ascii="Arial" w:hAnsi="Arial" w:cs="Arial"/>
-        </w:rPr>
-      </w:pPr>
-      <w:r>
-        <w:rPr>
-          <w:rFonts w:ascii="Arial" w:hAnsi="Arial" w:cs="Arial"/>
-        </w:rPr>
-        <w:t>Kierunek:</w:t>
-      </w:r>
-      <w:r>
-        <w:rPr>
-          <w:rFonts w:ascii="Arial" w:hAnsi="Arial" w:cs="Arial"/>
-        </w:rPr>
-        <w:t xml:space="preserve"> Informatyka</w:t>
-      </w:r>
-    </w:p>
-    <w:p>
-      <w:pPr>
-        <w:spacing w:after="0" w:line="360" w:lineRule="auto"/>
-        <w:ind w:left="4139"/>
-        <w:rPr>
-          <w:rFonts w:ascii="Arial" w:hAnsi="Arial" w:cs="Arial"/>
-        </w:rPr>
-      </w:pPr>
-      <w:r>
-        <w:rPr>
-          <w:rFonts w:ascii="Arial" w:hAnsi="Arial" w:cs="Arial"/>
-        </w:rPr>
-        <w:t>Forma studiów: stacjonarne</w:t>
-      </w:r>
-    </w:p>
-    <w:p>
-      <w:pPr>
-        <w:spacing w:after="0" w:line="360" w:lineRule="auto"/>
-        <w:ind w:left="4139"/>
-        <w:rPr>
-          <w:rFonts w:ascii="Arial" w:hAnsi="Arial" w:cs="Arial"/>
-        </w:rPr>
-      </w:pPr>
-      <w:r>
-        <w:rPr>
-          <w:rFonts w:ascii="Arial" w:hAnsi="Arial" w:cs="Arial"/>
-        </w:rPr>
-        <w:t>Poziom studiów: I</w:t>
-      </w:r>
-    </w:p>
-    <w:p>
-      <w:pPr>
-        <w:spacing w:after="120" w:line="360" w:lineRule="auto"/>
-        <w:ind w:left="4139"/>
+      </w:pPr>
+      <w:r>
         <w:rPr>
           <w:rFonts w:ascii="Arial" w:hAnsi="Arial" w:cs="Arial"/>
           <w:sz w:val="28"/>
           <w:szCs w:val="28"/>
         </w:rPr>
-      </w:pPr>
+        <w:t>Promotor pracy:</w:t>
+      </w:r>
       <w:r>
         <w:rPr>
           <w:rFonts w:ascii="Arial" w:hAnsi="Arial" w:cs="Arial"/>
           <w:sz w:val="28"/>
           <w:szCs w:val="28"/>
         </w:rPr>
-        <w:t>Promotor pracy:</w:t>
-      </w:r>
-      <w:r>
-        <w:rPr>
-          <w:rFonts w:ascii="Arial" w:hAnsi="Arial" w:cs="Arial"/>
-          <w:sz w:val="28"/>
-          <w:szCs w:val="28"/>
-        </w:rPr>
         <w:t xml:space="preserve"> dr hab. Inż. Krystian Łapa</w:t>
       </w:r>
     </w:p>
@@ -456,42 +346,14 @@
           <w:rFonts w:ascii="Arial" w:hAnsi="Arial" w:cs="Arial"/>
           <w:i/>
         </w:rPr>
-        <w:sectPr>
-          <w:footerReference w:type="even" r:id="rId7"/>
-          <w:footerReference w:type="default" r:id="rId8"/>
-          <w:pgSz w:w="11906" w:h="16838"/>
-          <w:pgMar w:top="1418" w:right="1418" w:bottom="1418" w:left="1418" w:header="709" w:footer="709" w:gutter="0"/>
-          <w:pgNumType w:start="1"/>
-          <w:cols w:space="708"/>
-          <w:docGrid w:linePitch="360"/>
-        </w:sectPr>
       </w:pPr>
       <w:r>
         <w:rPr>
           <w:rFonts w:ascii="Arial" w:hAnsi="Arial" w:cs="Arial"/>
           <w:i/>
         </w:rPr>
-        <w:t xml:space="preserve">Częstochowa, </w:t>
-      </w:r>
-      <w:proofErr w:type="gramStart"/>
-      <w:r>
-        <w:rPr>
-          <w:rFonts w:ascii="Arial" w:hAnsi="Arial" w:cs="Arial"/>
-          <w:i/>
-        </w:rPr>
-        <w:t>…….</w:t>
-      </w:r>
-      <w:proofErr w:type="gramEnd"/>
-    </w:p>
-    <w:p>
-      <w:pPr>
-        <w:pStyle w:val="Praca"/>
-      </w:pPr>
-    </w:p>
-    <w:p>
-      <w:pPr>
-        <w:pStyle w:val="Praca"/>
-      </w:pPr>
+        <w:t>Częstochowa, ……</w:t>
+      </w:r>
     </w:p>
     <w:p>
       <w:pPr>
@@ -501,29 +363,25 @@
         <w:textAlignment w:val="auto"/>
         <w:rPr>
           <w:rFonts w:ascii="Arial" w:hAnsi="Arial" w:cs="Arial"/>
-          <w:sz w:val="24"/>
-          <w:szCs w:val="24"/>
-        </w:rPr>
-      </w:pPr>
-      <w:r>
+          <w:i/>
+        </w:rPr>
+      </w:pPr>
+      <w:r>
+        <w:rPr>
+          <w:rFonts w:ascii="Arial" w:hAnsi="Arial" w:cs="Arial"/>
+          <w:i/>
+        </w:rPr>
         <w:br w:type="page"/>
       </w:r>
     </w:p>
     <w:p>
       <w:pPr>
-        <w:pStyle w:val="Praca"/>
-        <w:sectPr>
-          <w:pgSz w:w="11906" w:h="16838"/>
-          <w:pgMar w:top="1134" w:right="1134" w:bottom="1134" w:left="1985" w:header="709" w:footer="709" w:gutter="0"/>
-          <w:pgNumType w:start="3"/>
-          <w:cols w:space="708"/>
-          <w:docGrid w:linePitch="360"/>
-        </w:sectPr>
-      </w:pPr>
-    </w:p>
-    <w:p>
-      <w:pPr>
-        <w:pStyle w:val="Praca"/>
+        <w:spacing w:after="0" w:line="240" w:lineRule="auto"/>
+        <w:jc w:val="center"/>
+        <w:rPr>
+          <w:rFonts w:ascii="Arial" w:hAnsi="Arial" w:cs="Arial"/>
+          <w:i/>
+        </w:rPr>
       </w:pPr>
     </w:p>
     <w:p>
@@ -534,6 +392,688 @@
         <w:textAlignment w:val="auto"/>
         <w:rPr>
           <w:rFonts w:ascii="Arial" w:hAnsi="Arial" w:cs="Arial"/>
+          <w:i/>
+        </w:rPr>
+        <w:sectPr>
+          <w:footerReference w:type="even" r:id="rId9"/>
+          <w:footerReference w:type="default" r:id="rId10"/>
+          <w:pgSz w:w="11906" w:h="16838"/>
+          <w:pgMar w:top="1418" w:right="1418" w:bottom="1418" w:left="1418" w:header="709" w:footer="709" w:gutter="0"/>
+          <w:cols w:space="708"/>
+          <w:titlePg/>
+          <w:docGrid w:linePitch="360"/>
+        </w:sectPr>
+      </w:pPr>
+    </w:p>
+    <w:sdt>
+      <w:sdtPr>
+        <w:rPr>
+          <w:rFonts w:ascii="Calibri" w:eastAsia="Calibri" w:hAnsi="Calibri" w:cs="Times New Roman"/>
+          <w:color w:val="auto"/>
+          <w:sz w:val="22"/>
+          <w:szCs w:val="22"/>
+          <w:lang w:eastAsia="en-US"/>
+        </w:rPr>
+        <w:id w:val="132299839"/>
+        <w:docPartObj>
+          <w:docPartGallery w:val="Table of Contents"/>
+          <w:docPartUnique/>
+        </w:docPartObj>
+      </w:sdtPr>
+      <w:sdtEndPr>
+        <w:rPr>
+          <w:b/>
+          <w:bCs/>
+        </w:rPr>
+      </w:sdtEndPr>
+      <w:sdtContent>
+        <w:p>
+          <w:pPr>
+            <w:pStyle w:val="Nagwekspisutreci"/>
+          </w:pPr>
+          <w:r>
+            <w:t>Spis treści</w:t>
+          </w:r>
+        </w:p>
+        <w:p>
+          <w:pPr>
+            <w:pStyle w:val="Spistreci2"/>
+            <w:tabs>
+              <w:tab w:val="right" w:leader="dot" w:pos="8777"/>
+            </w:tabs>
+            <w:rPr>
+              <w:rFonts w:asciiTheme="minorHAnsi" w:eastAsiaTheme="minorEastAsia" w:hAnsiTheme="minorHAnsi" w:cstheme="minorBidi"/>
+              <w:noProof/>
+              <w:kern w:val="2"/>
+              <w:sz w:val="24"/>
+              <w:szCs w:val="24"/>
+              <w:lang w:eastAsia="pl-PL"/>
+              <w14:ligatures w14:val="standardContextual"/>
+            </w:rPr>
+          </w:pPr>
+          <w:r>
+            <w:fldChar w:fldCharType="begin"/>
+          </w:r>
+          <w:r>
+            <w:instrText xml:space="preserve"> TOC \o "1-3" \h \z \u </w:instrText>
+          </w:r>
+          <w:r>
+            <w:fldChar w:fldCharType="separate"/>
+          </w:r>
+          <w:hyperlink w:anchor="_Toc213483042" w:history="1">
+            <w:r>
+              <w:rPr>
+                <w:rStyle w:val="Hipercze"/>
+                <w:noProof/>
+              </w:rPr>
+              <w:t>1. Wstęp</w:t>
+            </w:r>
+            <w:r>
+              <w:rPr>
+                <w:noProof/>
+                <w:webHidden/>
+              </w:rPr>
+              <w:tab/>
+            </w:r>
+            <w:r>
+              <w:rPr>
+                <w:noProof/>
+                <w:webHidden/>
+              </w:rPr>
+              <w:fldChar w:fldCharType="begin"/>
+            </w:r>
+            <w:r>
+              <w:rPr>
+                <w:noProof/>
+                <w:webHidden/>
+              </w:rPr>
+              <w:instrText xml:space="preserve"> PAGEREF _Toc213483042 \h </w:instrText>
+            </w:r>
+            <w:r>
+              <w:rPr>
+                <w:noProof/>
+                <w:webHidden/>
+              </w:rPr>
+            </w:r>
+            <w:r>
+              <w:rPr>
+                <w:noProof/>
+                <w:webHidden/>
+              </w:rPr>
+              <w:fldChar w:fldCharType="separate"/>
+            </w:r>
+            <w:r>
+              <w:rPr>
+                <w:noProof/>
+                <w:webHidden/>
+              </w:rPr>
+              <w:t>5</w:t>
+            </w:r>
+            <w:r>
+              <w:rPr>
+                <w:noProof/>
+                <w:webHidden/>
+              </w:rPr>
+              <w:fldChar w:fldCharType="end"/>
+            </w:r>
+          </w:hyperlink>
+        </w:p>
+        <w:p>
+          <w:pPr>
+            <w:pStyle w:val="Spistreci2"/>
+            <w:tabs>
+              <w:tab w:val="right" w:leader="dot" w:pos="8777"/>
+            </w:tabs>
+            <w:rPr>
+              <w:rFonts w:asciiTheme="minorHAnsi" w:eastAsiaTheme="minorEastAsia" w:hAnsiTheme="minorHAnsi" w:cstheme="minorBidi"/>
+              <w:noProof/>
+              <w:kern w:val="2"/>
+              <w:sz w:val="24"/>
+              <w:szCs w:val="24"/>
+              <w:lang w:eastAsia="pl-PL"/>
+              <w14:ligatures w14:val="standardContextual"/>
+            </w:rPr>
+          </w:pPr>
+          <w:hyperlink w:anchor="_Toc213483043" w:history="1">
+            <w:r>
+              <w:rPr>
+                <w:rStyle w:val="Hipercze"/>
+                <w:noProof/>
+              </w:rPr>
+              <w:t>1.1 Proj</w:t>
+            </w:r>
+            <w:r>
+              <w:rPr>
+                <w:rStyle w:val="Hipercze"/>
+                <w:noProof/>
+              </w:rPr>
+              <w:t>e</w:t>
+            </w:r>
+            <w:r>
+              <w:rPr>
+                <w:rStyle w:val="Hipercze"/>
+                <w:noProof/>
+              </w:rPr>
+              <w:t>ktowanie Wnętrz</w:t>
+            </w:r>
+            <w:r>
+              <w:rPr>
+                <w:noProof/>
+                <w:webHidden/>
+              </w:rPr>
+              <w:tab/>
+            </w:r>
+            <w:r>
+              <w:rPr>
+                <w:noProof/>
+                <w:webHidden/>
+              </w:rPr>
+              <w:fldChar w:fldCharType="begin"/>
+            </w:r>
+            <w:r>
+              <w:rPr>
+                <w:noProof/>
+                <w:webHidden/>
+              </w:rPr>
+              <w:instrText xml:space="preserve"> PAGEREF _Toc213483043 \h </w:instrText>
+            </w:r>
+            <w:r>
+              <w:rPr>
+                <w:noProof/>
+                <w:webHidden/>
+              </w:rPr>
+            </w:r>
+            <w:r>
+              <w:rPr>
+                <w:noProof/>
+                <w:webHidden/>
+              </w:rPr>
+              <w:fldChar w:fldCharType="separate"/>
+            </w:r>
+            <w:r>
+              <w:rPr>
+                <w:noProof/>
+                <w:webHidden/>
+              </w:rPr>
+              <w:t>5</w:t>
+            </w:r>
+            <w:r>
+              <w:rPr>
+                <w:noProof/>
+                <w:webHidden/>
+              </w:rPr>
+              <w:fldChar w:fldCharType="end"/>
+            </w:r>
+          </w:hyperlink>
+        </w:p>
+        <w:p>
+          <w:pPr>
+            <w:pStyle w:val="Spistreci2"/>
+            <w:tabs>
+              <w:tab w:val="right" w:leader="dot" w:pos="8777"/>
+            </w:tabs>
+            <w:rPr>
+              <w:rFonts w:asciiTheme="minorHAnsi" w:eastAsiaTheme="minorEastAsia" w:hAnsiTheme="minorHAnsi" w:cstheme="minorBidi"/>
+              <w:noProof/>
+              <w:kern w:val="2"/>
+              <w:sz w:val="24"/>
+              <w:szCs w:val="24"/>
+              <w:lang w:eastAsia="pl-PL"/>
+              <w14:ligatures w14:val="standardContextual"/>
+            </w:rPr>
+          </w:pPr>
+          <w:hyperlink w:anchor="_Toc213483044" w:history="1">
+            <w:r>
+              <w:rPr>
+                <w:rStyle w:val="Hipercze"/>
+                <w:noProof/>
+              </w:rPr>
+              <w:t>1.2 Wirtualna Rzeczywistość</w:t>
+            </w:r>
+            <w:r>
+              <w:rPr>
+                <w:noProof/>
+                <w:webHidden/>
+              </w:rPr>
+              <w:tab/>
+            </w:r>
+            <w:r>
+              <w:rPr>
+                <w:noProof/>
+                <w:webHidden/>
+              </w:rPr>
+              <w:fldChar w:fldCharType="begin"/>
+            </w:r>
+            <w:r>
+              <w:rPr>
+                <w:noProof/>
+                <w:webHidden/>
+              </w:rPr>
+              <w:instrText xml:space="preserve"> PAGEREF _Toc213483044 \h </w:instrText>
+            </w:r>
+            <w:r>
+              <w:rPr>
+                <w:noProof/>
+                <w:webHidden/>
+              </w:rPr>
+            </w:r>
+            <w:r>
+              <w:rPr>
+                <w:noProof/>
+                <w:webHidden/>
+              </w:rPr>
+              <w:fldChar w:fldCharType="separate"/>
+            </w:r>
+            <w:r>
+              <w:rPr>
+                <w:noProof/>
+                <w:webHidden/>
+              </w:rPr>
+              <w:t>7</w:t>
+            </w:r>
+            <w:r>
+              <w:rPr>
+                <w:noProof/>
+                <w:webHidden/>
+              </w:rPr>
+              <w:fldChar w:fldCharType="end"/>
+            </w:r>
+          </w:hyperlink>
+        </w:p>
+        <w:p>
+          <w:pPr>
+            <w:pStyle w:val="Spistreci2"/>
+            <w:tabs>
+              <w:tab w:val="right" w:leader="dot" w:pos="8777"/>
+            </w:tabs>
+            <w:rPr>
+              <w:rFonts w:asciiTheme="minorHAnsi" w:eastAsiaTheme="minorEastAsia" w:hAnsiTheme="minorHAnsi" w:cstheme="minorBidi"/>
+              <w:noProof/>
+              <w:kern w:val="2"/>
+              <w:sz w:val="24"/>
+              <w:szCs w:val="24"/>
+              <w:lang w:eastAsia="pl-PL"/>
+              <w14:ligatures w14:val="standardContextual"/>
+            </w:rPr>
+          </w:pPr>
+          <w:hyperlink w:anchor="_Toc213483045" w:history="1">
+            <w:r>
+              <w:rPr>
+                <w:rStyle w:val="Hipercze"/>
+                <w:noProof/>
+              </w:rPr>
+              <w:t>1.3 Zastosowanie</w:t>
+            </w:r>
+            <w:r>
+              <w:rPr>
+                <w:noProof/>
+                <w:webHidden/>
+              </w:rPr>
+              <w:tab/>
+            </w:r>
+            <w:r>
+              <w:rPr>
+                <w:noProof/>
+                <w:webHidden/>
+              </w:rPr>
+              <w:fldChar w:fldCharType="begin"/>
+            </w:r>
+            <w:r>
+              <w:rPr>
+                <w:noProof/>
+                <w:webHidden/>
+              </w:rPr>
+              <w:instrText xml:space="preserve"> PAGEREF _Toc213483045 \h </w:instrText>
+            </w:r>
+            <w:r>
+              <w:rPr>
+                <w:noProof/>
+                <w:webHidden/>
+              </w:rPr>
+            </w:r>
+            <w:r>
+              <w:rPr>
+                <w:noProof/>
+                <w:webHidden/>
+              </w:rPr>
+              <w:fldChar w:fldCharType="separate"/>
+            </w:r>
+            <w:r>
+              <w:rPr>
+                <w:noProof/>
+                <w:webHidden/>
+              </w:rPr>
+              <w:t>9</w:t>
+            </w:r>
+            <w:r>
+              <w:rPr>
+                <w:noProof/>
+                <w:webHidden/>
+              </w:rPr>
+              <w:fldChar w:fldCharType="end"/>
+            </w:r>
+          </w:hyperlink>
+        </w:p>
+        <w:p>
+          <w:pPr>
+            <w:pStyle w:val="Spistreci2"/>
+            <w:tabs>
+              <w:tab w:val="right" w:leader="dot" w:pos="8777"/>
+            </w:tabs>
+            <w:rPr>
+              <w:rFonts w:asciiTheme="minorHAnsi" w:eastAsiaTheme="minorEastAsia" w:hAnsiTheme="minorHAnsi" w:cstheme="minorBidi"/>
+              <w:noProof/>
+              <w:kern w:val="2"/>
+              <w:sz w:val="24"/>
+              <w:szCs w:val="24"/>
+              <w:lang w:eastAsia="pl-PL"/>
+              <w14:ligatures w14:val="standardContextual"/>
+            </w:rPr>
+          </w:pPr>
+          <w:hyperlink w:anchor="_Toc213483046" w:history="1">
+            <w:r>
+              <w:rPr>
+                <w:rStyle w:val="Hipercze"/>
+                <w:noProof/>
+              </w:rPr>
+              <w:t>2. Cel Pracy</w:t>
+            </w:r>
+            <w:r>
+              <w:rPr>
+                <w:noProof/>
+                <w:webHidden/>
+              </w:rPr>
+              <w:tab/>
+            </w:r>
+            <w:r>
+              <w:rPr>
+                <w:noProof/>
+                <w:webHidden/>
+              </w:rPr>
+              <w:fldChar w:fldCharType="begin"/>
+            </w:r>
+            <w:r>
+              <w:rPr>
+                <w:noProof/>
+                <w:webHidden/>
+              </w:rPr>
+              <w:instrText xml:space="preserve"> PAGEREF _Toc213483046 \h </w:instrText>
+            </w:r>
+            <w:r>
+              <w:rPr>
+                <w:noProof/>
+                <w:webHidden/>
+              </w:rPr>
+            </w:r>
+            <w:r>
+              <w:rPr>
+                <w:noProof/>
+                <w:webHidden/>
+              </w:rPr>
+              <w:fldChar w:fldCharType="separate"/>
+            </w:r>
+            <w:r>
+              <w:rPr>
+                <w:noProof/>
+                <w:webHidden/>
+              </w:rPr>
+              <w:t>14</w:t>
+            </w:r>
+            <w:r>
+              <w:rPr>
+                <w:noProof/>
+                <w:webHidden/>
+              </w:rPr>
+              <w:fldChar w:fldCharType="end"/>
+            </w:r>
+          </w:hyperlink>
+        </w:p>
+        <w:p>
+          <w:pPr>
+            <w:pStyle w:val="Spistreci2"/>
+            <w:tabs>
+              <w:tab w:val="right" w:leader="dot" w:pos="8777"/>
+            </w:tabs>
+            <w:rPr>
+              <w:rFonts w:asciiTheme="minorHAnsi" w:eastAsiaTheme="minorEastAsia" w:hAnsiTheme="minorHAnsi" w:cstheme="minorBidi"/>
+              <w:noProof/>
+              <w:kern w:val="2"/>
+              <w:sz w:val="24"/>
+              <w:szCs w:val="24"/>
+              <w:lang w:eastAsia="pl-PL"/>
+              <w14:ligatures w14:val="standardContextual"/>
+            </w:rPr>
+          </w:pPr>
+          <w:hyperlink w:anchor="_Toc213483047" w:history="1">
+            <w:r>
+              <w:rPr>
+                <w:rStyle w:val="Hipercze"/>
+                <w:noProof/>
+              </w:rPr>
+              <w:t>2.1 Dziedzina Pracy</w:t>
+            </w:r>
+            <w:r>
+              <w:rPr>
+                <w:noProof/>
+                <w:webHidden/>
+              </w:rPr>
+              <w:tab/>
+            </w:r>
+            <w:r>
+              <w:rPr>
+                <w:noProof/>
+                <w:webHidden/>
+              </w:rPr>
+              <w:fldChar w:fldCharType="begin"/>
+            </w:r>
+            <w:r>
+              <w:rPr>
+                <w:noProof/>
+                <w:webHidden/>
+              </w:rPr>
+              <w:instrText xml:space="preserve"> PAGEREF _Toc213483047 \h </w:instrText>
+            </w:r>
+            <w:r>
+              <w:rPr>
+                <w:noProof/>
+                <w:webHidden/>
+              </w:rPr>
+            </w:r>
+            <w:r>
+              <w:rPr>
+                <w:noProof/>
+                <w:webHidden/>
+              </w:rPr>
+              <w:fldChar w:fldCharType="separate"/>
+            </w:r>
+            <w:r>
+              <w:rPr>
+                <w:noProof/>
+                <w:webHidden/>
+              </w:rPr>
+              <w:t>14</w:t>
+            </w:r>
+            <w:r>
+              <w:rPr>
+                <w:noProof/>
+                <w:webHidden/>
+              </w:rPr>
+              <w:fldChar w:fldCharType="end"/>
+            </w:r>
+          </w:hyperlink>
+        </w:p>
+        <w:p>
+          <w:pPr>
+            <w:pStyle w:val="Spistreci2"/>
+            <w:tabs>
+              <w:tab w:val="right" w:leader="dot" w:pos="8777"/>
+            </w:tabs>
+            <w:rPr>
+              <w:rFonts w:asciiTheme="minorHAnsi" w:eastAsiaTheme="minorEastAsia" w:hAnsiTheme="minorHAnsi" w:cstheme="minorBidi"/>
+              <w:noProof/>
+              <w:kern w:val="2"/>
+              <w:sz w:val="24"/>
+              <w:szCs w:val="24"/>
+              <w:lang w:eastAsia="pl-PL"/>
+              <w14:ligatures w14:val="standardContextual"/>
+            </w:rPr>
+          </w:pPr>
+          <w:hyperlink w:anchor="_Toc213483048" w:history="1">
+            <w:r>
+              <w:rPr>
+                <w:rStyle w:val="Hipercze"/>
+                <w:noProof/>
+              </w:rPr>
+              <w:t>2.2 Część Teoretyczna</w:t>
+            </w:r>
+            <w:r>
+              <w:rPr>
+                <w:noProof/>
+                <w:webHidden/>
+              </w:rPr>
+              <w:tab/>
+            </w:r>
+            <w:r>
+              <w:rPr>
+                <w:noProof/>
+                <w:webHidden/>
+              </w:rPr>
+              <w:fldChar w:fldCharType="begin"/>
+            </w:r>
+            <w:r>
+              <w:rPr>
+                <w:noProof/>
+                <w:webHidden/>
+              </w:rPr>
+              <w:instrText xml:space="preserve"> PAGEREF _Toc213483048 \h </w:instrText>
+            </w:r>
+            <w:r>
+              <w:rPr>
+                <w:noProof/>
+                <w:webHidden/>
+              </w:rPr>
+            </w:r>
+            <w:r>
+              <w:rPr>
+                <w:noProof/>
+                <w:webHidden/>
+              </w:rPr>
+              <w:fldChar w:fldCharType="separate"/>
+            </w:r>
+            <w:r>
+              <w:rPr>
+                <w:noProof/>
+                <w:webHidden/>
+              </w:rPr>
+              <w:t>14</w:t>
+            </w:r>
+            <w:r>
+              <w:rPr>
+                <w:noProof/>
+                <w:webHidden/>
+              </w:rPr>
+              <w:fldChar w:fldCharType="end"/>
+            </w:r>
+          </w:hyperlink>
+        </w:p>
+        <w:p>
+          <w:pPr>
+            <w:pStyle w:val="Spistreci2"/>
+            <w:tabs>
+              <w:tab w:val="right" w:leader="dot" w:pos="8777"/>
+            </w:tabs>
+            <w:rPr>
+              <w:rFonts w:asciiTheme="minorHAnsi" w:eastAsiaTheme="minorEastAsia" w:hAnsiTheme="minorHAnsi" w:cstheme="minorBidi"/>
+              <w:noProof/>
+              <w:kern w:val="2"/>
+              <w:sz w:val="24"/>
+              <w:szCs w:val="24"/>
+              <w:lang w:eastAsia="pl-PL"/>
+              <w14:ligatures w14:val="standardContextual"/>
+            </w:rPr>
+          </w:pPr>
+          <w:hyperlink w:anchor="_Toc213483049" w:history="1">
+            <w:r>
+              <w:rPr>
+                <w:rStyle w:val="Hipercze"/>
+                <w:noProof/>
+              </w:rPr>
+              <w:t>2.3  Część Praktyczna</w:t>
+            </w:r>
+            <w:r>
+              <w:rPr>
+                <w:noProof/>
+                <w:webHidden/>
+              </w:rPr>
+              <w:tab/>
+            </w:r>
+            <w:r>
+              <w:rPr>
+                <w:noProof/>
+                <w:webHidden/>
+              </w:rPr>
+              <w:fldChar w:fldCharType="begin"/>
+            </w:r>
+            <w:r>
+              <w:rPr>
+                <w:noProof/>
+                <w:webHidden/>
+              </w:rPr>
+              <w:instrText xml:space="preserve"> PAGEREF _Toc213483049 \h </w:instrText>
+            </w:r>
+            <w:r>
+              <w:rPr>
+                <w:noProof/>
+                <w:webHidden/>
+              </w:rPr>
+            </w:r>
+            <w:r>
+              <w:rPr>
+                <w:noProof/>
+                <w:webHidden/>
+              </w:rPr>
+              <w:fldChar w:fldCharType="separate"/>
+            </w:r>
+            <w:r>
+              <w:rPr>
+                <w:noProof/>
+                <w:webHidden/>
+              </w:rPr>
+              <w:t>15</w:t>
+            </w:r>
+            <w:r>
+              <w:rPr>
+                <w:noProof/>
+                <w:webHidden/>
+              </w:rPr>
+              <w:fldChar w:fldCharType="end"/>
+            </w:r>
+          </w:hyperlink>
+        </w:p>
+        <w:p>
+          <w:r>
+            <w:rPr>
+              <w:b/>
+              <w:bCs/>
+            </w:rPr>
+            <w:fldChar w:fldCharType="end"/>
+          </w:r>
+        </w:p>
+      </w:sdtContent>
+    </w:sdt>
+    <w:p>
+      <w:pPr>
+        <w:pStyle w:val="Praca"/>
+      </w:pPr>
+    </w:p>
+    <w:p>
+      <w:pPr>
+        <w:suppressAutoHyphens w:val="0"/>
+        <w:autoSpaceDN/>
+        <w:spacing w:after="0" w:line="240" w:lineRule="auto"/>
+        <w:textAlignment w:val="auto"/>
+        <w:rPr>
+          <w:rFonts w:ascii="Arial" w:hAnsi="Arial" w:cs="Arial"/>
           <w:sz w:val="24"/>
           <w:szCs w:val="24"/>
         </w:rPr>
@@ -544,11 +1084,2326 @@
     </w:p>
     <w:p>
       <w:pPr>
+        <w:pStyle w:val="Nagwek2"/>
+      </w:pPr>
+      <w:bookmarkStart w:id="0" w:name="_Toc213483042"/>
+    </w:p>
+    <w:p>
+      <w:pPr>
+        <w:suppressAutoHyphens w:val="0"/>
+        <w:autoSpaceDN/>
+        <w:spacing w:after="0" w:line="240" w:lineRule="auto"/>
+        <w:textAlignment w:val="auto"/>
+        <w:rPr>
+          <w:rFonts w:asciiTheme="majorHAnsi" w:eastAsiaTheme="majorEastAsia" w:hAnsiTheme="majorHAnsi" w:cstheme="majorBidi"/>
+          <w:color w:val="2E74B5" w:themeColor="accent1" w:themeShade="BF"/>
+          <w:sz w:val="26"/>
+          <w:szCs w:val="26"/>
+        </w:rPr>
+      </w:pPr>
+      <w:r>
+        <w:br w:type="page"/>
+      </w:r>
+    </w:p>
+    <w:p>
+      <w:pPr>
+        <w:pStyle w:val="Nagwek2"/>
+      </w:pPr>
+      <w:r>
+        <w:lastRenderedPageBreak/>
+        <w:t>1.</w:t>
+      </w:r>
+      <w:r>
+        <w:t xml:space="preserve"> </w:t>
+      </w:r>
+      <w:r>
+        <w:t>Wstęp</w:t>
+      </w:r>
+      <w:bookmarkEnd w:id="0"/>
+    </w:p>
+    <w:p>
+      <w:pPr>
+        <w:pStyle w:val="Praca"/>
+      </w:pPr>
+      <w:r>
+        <w:tab/>
+        <w:t>Jedną z podstawowych rzeczy jaką trzeba wykonać podczas planowania dekoracji wnętrza jest jej wizualizacja. Stworzenie wirtualnego środowiska, gdzie można zobaczyć jak będzie wyglądać przeszły dom lub pokój. W dobie internetu oraz komputerów człowiek ma dostęp do różnego rodzaju oprogramowania, które ma mu służyć jako pomoc w projektowaniu wnętrz. Jednak zawsze ta wizualizacja jest mało przejrzysta, bo to co widzimy to obrazek na ekranie komputera. Wygodniej by było wejść do tego wirtualnego świata i na własne oczy zobaczyć jak zaprojektowane pomieszczenie wygląda. Tu z pomocą przychodzi technologia wirtualnej rzeczywistości umożliwiająca wstąpić w cyfrowy świat.</w:t>
+      </w:r>
+    </w:p>
+    <w:p>
+      <w:pPr>
+        <w:pStyle w:val="Nagwek2"/>
+      </w:pPr>
+      <w:bookmarkStart w:id="1" w:name="_Toc213483043"/>
+      <w:r>
+        <w:t xml:space="preserve">1.1 </w:t>
+      </w:r>
+      <w:r>
+        <w:t xml:space="preserve">Wirtualne </w:t>
+      </w:r>
+      <w:r>
+        <w:t>Projektowanie Wnętrz</w:t>
+      </w:r>
+      <w:bookmarkEnd w:id="1"/>
+    </w:p>
+    <w:p>
+      <w:pPr>
+        <w:pStyle w:val="Praca"/>
+        <w:ind w:firstLine="708"/>
+      </w:pPr>
+      <w:r>
+        <w:t xml:space="preserve">Ważnym punktem podczas remontu, czy </w:t>
+      </w:r>
+      <w:r>
+        <w:t>planowaniu nowego domu jest zwizualizowanie jak to wszystko będzie wyglądać. Pomaga to w zaplanowaniu zakupów potrzebnych rzeczy, ale i również w pokazaniu jak całość się będzie prezentować. Wygodnym sposobem na zaprojektowanie wnętrza jest użycie specjalistycznych programów, które są wstanie pokazać użytkownikowi jak jego pokój będzie się prezentować. Ważnymi elementami takich programów są oddanie skali pomieszczenia oraz łatwe i intuicyjne posługiwanie się nimi. Na rynku jest multum systemów służących do tego zadania.</w:t>
+      </w:r>
+    </w:p>
+    <w:p>
+      <w:pPr>
+        <w:pStyle w:val="Praca"/>
+        <w:ind w:firstLine="708"/>
+      </w:pPr>
+    </w:p>
+    <w:p>
+      <w:pPr>
+        <w:pStyle w:val="Praca"/>
+        <w:ind w:firstLine="708"/>
+      </w:pPr>
+    </w:p>
+    <w:p>
+      <w:pPr>
+        <w:pStyle w:val="Praca"/>
+        <w:ind w:firstLine="708"/>
+      </w:pPr>
+    </w:p>
+    <w:p>
+      <w:pPr>
+        <w:pStyle w:val="Praca"/>
+        <w:ind w:firstLine="708"/>
+      </w:pPr>
+    </w:p>
+    <w:p>
+      <w:pPr>
+        <w:pStyle w:val="Praca"/>
+        <w:ind w:firstLine="708"/>
+      </w:pPr>
+    </w:p>
+    <w:p>
+      <w:pPr>
+        <w:pStyle w:val="Praca"/>
+        <w:ind w:firstLine="708"/>
+      </w:pPr>
+    </w:p>
+    <w:p>
+      <w:pPr>
+        <w:pStyle w:val="Praca"/>
+        <w:ind w:firstLine="708"/>
+      </w:pPr>
+    </w:p>
+    <w:p>
+      <w:pPr>
+        <w:pStyle w:val="Praca"/>
+        <w:ind w:firstLine="708"/>
+      </w:pPr>
+    </w:p>
+    <w:p>
+      <w:pPr>
+        <w:pStyle w:val="Praca"/>
+        <w:ind w:firstLine="708"/>
+      </w:pPr>
+    </w:p>
+    <w:p>
+      <w:pPr>
+        <w:pStyle w:val="Praca"/>
+        <w:ind w:firstLine="708"/>
+      </w:pPr>
+    </w:p>
+    <w:p>
+      <w:pPr>
+        <w:pStyle w:val="Praca"/>
+        <w:ind w:firstLine="708"/>
+      </w:pPr>
+    </w:p>
+    <w:p>
+      <w:pPr>
+        <w:pStyle w:val="Praca"/>
+        <w:ind w:firstLine="708"/>
+      </w:pPr>
+    </w:p>
+    <w:p>
+      <w:pPr>
+        <w:pStyle w:val="Praca"/>
+        <w:ind w:firstLine="708"/>
+      </w:pPr>
+    </w:p>
+    <w:p>
+      <w:pPr>
+        <w:pStyle w:val="Praca"/>
+        <w:ind w:firstLine="708"/>
+      </w:pPr>
+    </w:p>
+    <w:p>
+      <w:pPr>
+        <w:pStyle w:val="Praca"/>
+        <w:ind w:firstLine="708"/>
+      </w:pPr>
+    </w:p>
+    <w:p>
+      <w:pPr>
+        <w:pStyle w:val="Praca"/>
+      </w:pPr>
+      <w:r>
+        <w:lastRenderedPageBreak/>
+        <w:t>Tabela 1.1 Spis przykładowych programów do projektowania wnętrz</w:t>
+      </w:r>
+    </w:p>
+    <w:tbl>
+      <w:tblPr>
+        <w:tblStyle w:val="Tabela-Siatka"/>
+        <w:tblW w:w="0" w:type="auto"/>
+        <w:tblInd w:w="38" w:type="dxa"/>
+        <w:tblLook w:val="04A0" w:firstRow="1" w:lastRow="0" w:firstColumn="1" w:lastColumn="0" w:noHBand="0" w:noVBand="1"/>
+      </w:tblPr>
+      <w:tblGrid>
+        <w:gridCol w:w="1761"/>
+        <w:gridCol w:w="1774"/>
+        <w:gridCol w:w="1879"/>
+        <w:gridCol w:w="1765"/>
+        <w:gridCol w:w="1786"/>
+      </w:tblGrid>
+      <w:tr>
+        <w:trPr>
+          <w:trHeight w:val="914"/>
+        </w:trPr>
+        <w:tc>
+          <w:tcPr>
+            <w:tcW w:w="1789" w:type="dxa"/>
+          </w:tcPr>
+          <w:p>
+            <w:pPr>
+              <w:pStyle w:val="Praca"/>
+              <w:jc w:val="left"/>
+              <w:rPr>
+                <w:sz w:val="22"/>
+                <w:szCs w:val="22"/>
+              </w:rPr>
+            </w:pPr>
+            <w:r>
+              <w:rPr>
+                <w:sz w:val="22"/>
+                <w:szCs w:val="22"/>
+              </w:rPr>
+              <w:t>Nazwa</w:t>
+            </w:r>
+          </w:p>
+        </w:tc>
+        <w:tc>
+          <w:tcPr>
+            <w:tcW w:w="1790" w:type="dxa"/>
+          </w:tcPr>
+          <w:p>
+            <w:pPr>
+              <w:pStyle w:val="Praca"/>
+              <w:jc w:val="left"/>
+              <w:rPr>
+                <w:sz w:val="22"/>
+                <w:szCs w:val="22"/>
+              </w:rPr>
+            </w:pPr>
+            <w:r>
+              <w:rPr>
+                <w:sz w:val="22"/>
+                <w:szCs w:val="22"/>
+              </w:rPr>
+              <w:t>Forma płatności</w:t>
+            </w:r>
+          </w:p>
+        </w:tc>
+        <w:tc>
+          <w:tcPr>
+            <w:tcW w:w="1790" w:type="dxa"/>
+          </w:tcPr>
+          <w:p>
+            <w:pPr>
+              <w:pStyle w:val="Praca"/>
+              <w:jc w:val="left"/>
+              <w:rPr>
+                <w:sz w:val="22"/>
+                <w:szCs w:val="22"/>
+              </w:rPr>
+            </w:pPr>
+            <w:r>
+              <w:rPr>
+                <w:sz w:val="22"/>
+                <w:szCs w:val="22"/>
+              </w:rPr>
+              <w:t>Cena</w:t>
+            </w:r>
+          </w:p>
+        </w:tc>
+        <w:tc>
+          <w:tcPr>
+            <w:tcW w:w="1790" w:type="dxa"/>
+          </w:tcPr>
+          <w:p>
+            <w:pPr>
+              <w:pStyle w:val="Praca"/>
+              <w:jc w:val="left"/>
+              <w:rPr>
+                <w:sz w:val="22"/>
+                <w:szCs w:val="22"/>
+              </w:rPr>
+            </w:pPr>
+            <w:r>
+              <w:rPr>
+                <w:sz w:val="22"/>
+                <w:szCs w:val="22"/>
+              </w:rPr>
+              <w:t>Forma Wizualizacji</w:t>
+            </w:r>
+          </w:p>
+        </w:tc>
+        <w:tc>
+          <w:tcPr>
+            <w:tcW w:w="1790" w:type="dxa"/>
+          </w:tcPr>
+          <w:p>
+            <w:pPr>
+              <w:pStyle w:val="Praca"/>
+              <w:jc w:val="left"/>
+              <w:rPr>
+                <w:sz w:val="22"/>
+                <w:szCs w:val="22"/>
+              </w:rPr>
+            </w:pPr>
+            <w:r>
+              <w:rPr>
+                <w:sz w:val="22"/>
+                <w:szCs w:val="22"/>
+              </w:rPr>
+              <w:t>Oferowane Usługi</w:t>
+            </w:r>
+          </w:p>
+        </w:tc>
+      </w:tr>
+      <w:tr>
+        <w:trPr>
+          <w:trHeight w:val="450"/>
+        </w:trPr>
+        <w:tc>
+          <w:tcPr>
+            <w:tcW w:w="1789" w:type="dxa"/>
+          </w:tcPr>
+          <w:p>
+            <w:pPr>
+              <w:pStyle w:val="Praca"/>
+              <w:jc w:val="left"/>
+              <w:rPr>
+                <w:sz w:val="22"/>
+                <w:szCs w:val="22"/>
+              </w:rPr>
+            </w:pPr>
+            <w:r>
+              <w:rPr>
+                <w:sz w:val="22"/>
+                <w:szCs w:val="22"/>
+              </w:rPr>
+              <w:t>Homestyler</w:t>
+            </w:r>
+          </w:p>
+        </w:tc>
+        <w:tc>
+          <w:tcPr>
+            <w:tcW w:w="1790" w:type="dxa"/>
+          </w:tcPr>
+          <w:p>
+            <w:pPr>
+              <w:pStyle w:val="Praca"/>
+              <w:jc w:val="left"/>
+              <w:rPr>
+                <w:sz w:val="22"/>
+                <w:szCs w:val="22"/>
+              </w:rPr>
+            </w:pPr>
+            <w:r>
+              <w:rPr>
+                <w:sz w:val="22"/>
+                <w:szCs w:val="22"/>
+              </w:rPr>
+              <w:t>Abonament</w:t>
+            </w:r>
+          </w:p>
+        </w:tc>
+        <w:tc>
+          <w:tcPr>
+            <w:tcW w:w="1790" w:type="dxa"/>
+          </w:tcPr>
+          <w:p>
+            <w:pPr>
+              <w:pStyle w:val="Praca"/>
+              <w:jc w:val="left"/>
+              <w:rPr>
+                <w:sz w:val="22"/>
+                <w:szCs w:val="22"/>
+              </w:rPr>
+            </w:pPr>
+            <w:r>
+              <w:rPr>
+                <w:sz w:val="22"/>
+                <w:szCs w:val="22"/>
+              </w:rPr>
+              <w:t>Darmowy/$19.6</w:t>
+            </w:r>
+          </w:p>
+        </w:tc>
+        <w:tc>
+          <w:tcPr>
+            <w:tcW w:w="1790" w:type="dxa"/>
+          </w:tcPr>
+          <w:p>
+            <w:pPr>
+              <w:pStyle w:val="Praca"/>
+              <w:jc w:val="left"/>
+              <w:rPr>
+                <w:sz w:val="22"/>
+                <w:szCs w:val="22"/>
+              </w:rPr>
+            </w:pPr>
+            <w:r>
+              <w:rPr>
+                <w:sz w:val="22"/>
+                <w:szCs w:val="22"/>
+              </w:rPr>
+              <w:t>Flat/VR</w:t>
+            </w:r>
+          </w:p>
+        </w:tc>
+        <w:tc>
+          <w:tcPr>
+            <w:tcW w:w="1790" w:type="dxa"/>
+          </w:tcPr>
+          <w:p>
+            <w:pPr>
+              <w:pStyle w:val="Praca"/>
+              <w:jc w:val="left"/>
+              <w:rPr>
+                <w:sz w:val="22"/>
+                <w:szCs w:val="22"/>
+              </w:rPr>
+            </w:pPr>
+            <w:r>
+              <w:rPr>
+                <w:sz w:val="22"/>
+                <w:szCs w:val="22"/>
+              </w:rPr>
+              <w:t>Duża baza mebli, Konwertowanie planow 2D na 3D, Prezentacja VR, Moduł AI</w:t>
+            </w:r>
+          </w:p>
+        </w:tc>
+      </w:tr>
+      <w:tr>
+        <w:trPr>
+          <w:trHeight w:val="914"/>
+        </w:trPr>
+        <w:tc>
+          <w:tcPr>
+            <w:tcW w:w="1789" w:type="dxa"/>
+          </w:tcPr>
+          <w:p>
+            <w:pPr>
+              <w:pStyle w:val="Praca"/>
+              <w:jc w:val="left"/>
+              <w:rPr>
+                <w:sz w:val="22"/>
+                <w:szCs w:val="22"/>
+              </w:rPr>
+            </w:pPr>
+            <w:r>
+              <w:rPr>
+                <w:sz w:val="22"/>
+                <w:szCs w:val="22"/>
+              </w:rPr>
+              <w:t>Sweet Home 3D</w:t>
+            </w:r>
+          </w:p>
+        </w:tc>
+        <w:tc>
+          <w:tcPr>
+            <w:tcW w:w="1790" w:type="dxa"/>
+          </w:tcPr>
+          <w:p>
+            <w:pPr>
+              <w:pStyle w:val="Praca"/>
+              <w:jc w:val="left"/>
+              <w:rPr>
+                <w:sz w:val="22"/>
+                <w:szCs w:val="22"/>
+              </w:rPr>
+            </w:pPr>
+            <w:r>
+              <w:rPr>
+                <w:sz w:val="22"/>
+                <w:szCs w:val="22"/>
+              </w:rPr>
+              <w:t>-</w:t>
+            </w:r>
+          </w:p>
+        </w:tc>
+        <w:tc>
+          <w:tcPr>
+            <w:tcW w:w="1790" w:type="dxa"/>
+          </w:tcPr>
+          <w:p>
+            <w:pPr>
+              <w:pStyle w:val="Praca"/>
+              <w:jc w:val="left"/>
+              <w:rPr>
+                <w:sz w:val="22"/>
+                <w:szCs w:val="22"/>
+              </w:rPr>
+            </w:pPr>
+            <w:r>
+              <w:rPr>
+                <w:sz w:val="22"/>
+                <w:szCs w:val="22"/>
+              </w:rPr>
+              <w:t>Darmowy</w:t>
+            </w:r>
+          </w:p>
+        </w:tc>
+        <w:tc>
+          <w:tcPr>
+            <w:tcW w:w="1790" w:type="dxa"/>
+          </w:tcPr>
+          <w:p>
+            <w:pPr>
+              <w:pStyle w:val="Praca"/>
+              <w:jc w:val="left"/>
+              <w:rPr>
+                <w:sz w:val="22"/>
+                <w:szCs w:val="22"/>
+              </w:rPr>
+            </w:pPr>
+            <w:r>
+              <w:rPr>
+                <w:sz w:val="22"/>
+                <w:szCs w:val="22"/>
+              </w:rPr>
+              <w:t>Flat</w:t>
+            </w:r>
+          </w:p>
+        </w:tc>
+        <w:tc>
+          <w:tcPr>
+            <w:tcW w:w="1790" w:type="dxa"/>
+          </w:tcPr>
+          <w:p>
+            <w:pPr>
+              <w:pStyle w:val="Praca"/>
+              <w:jc w:val="left"/>
+              <w:rPr>
+                <w:sz w:val="22"/>
+                <w:szCs w:val="22"/>
+              </w:rPr>
+            </w:pPr>
+            <w:r>
+              <w:rPr>
+                <w:sz w:val="22"/>
+                <w:szCs w:val="22"/>
+              </w:rPr>
+              <w:t>Spora biblioteka mebli, możliwość tworzenia własnych wtyczek</w:t>
+            </w:r>
+          </w:p>
+        </w:tc>
+      </w:tr>
+      <w:tr>
+        <w:trPr>
+          <w:trHeight w:val="914"/>
+        </w:trPr>
+        <w:tc>
+          <w:tcPr>
+            <w:tcW w:w="1789" w:type="dxa"/>
+          </w:tcPr>
+          <w:p>
+            <w:pPr>
+              <w:pStyle w:val="Praca"/>
+              <w:jc w:val="left"/>
+              <w:rPr>
+                <w:sz w:val="22"/>
+                <w:szCs w:val="22"/>
+              </w:rPr>
+            </w:pPr>
+            <w:r>
+              <w:rPr>
+                <w:sz w:val="22"/>
+                <w:szCs w:val="22"/>
+              </w:rPr>
+              <w:t>Sketch Up</w:t>
+            </w:r>
+          </w:p>
+        </w:tc>
+        <w:tc>
+          <w:tcPr>
+            <w:tcW w:w="1790" w:type="dxa"/>
+          </w:tcPr>
+          <w:p>
+            <w:pPr>
+              <w:pStyle w:val="Praca"/>
+              <w:jc w:val="left"/>
+              <w:rPr>
+                <w:sz w:val="22"/>
+                <w:szCs w:val="22"/>
+              </w:rPr>
+            </w:pPr>
+            <w:r>
+              <w:rPr>
+                <w:sz w:val="22"/>
+                <w:szCs w:val="22"/>
+              </w:rPr>
+              <w:t>Zakup licencji</w:t>
+            </w:r>
+            <w:r>
+              <w:rPr>
+                <w:sz w:val="22"/>
+                <w:szCs w:val="22"/>
+              </w:rPr>
+              <w:t xml:space="preserve"> na rok</w:t>
+            </w:r>
+          </w:p>
+        </w:tc>
+        <w:tc>
+          <w:tcPr>
+            <w:tcW w:w="1790" w:type="dxa"/>
+          </w:tcPr>
+          <w:p>
+            <w:pPr>
+              <w:pStyle w:val="Praca"/>
+              <w:jc w:val="left"/>
+              <w:rPr>
+                <w:sz w:val="22"/>
+                <w:szCs w:val="22"/>
+              </w:rPr>
+            </w:pPr>
+            <w:r>
+              <w:rPr>
+                <w:sz w:val="22"/>
+                <w:szCs w:val="22"/>
+              </w:rPr>
+              <w:t>1 786,73 zł-5 136 zł</w:t>
+            </w:r>
+          </w:p>
+        </w:tc>
+        <w:tc>
+          <w:tcPr>
+            <w:tcW w:w="1790" w:type="dxa"/>
+          </w:tcPr>
+          <w:p>
+            <w:pPr>
+              <w:pStyle w:val="Praca"/>
+              <w:jc w:val="left"/>
+              <w:rPr>
+                <w:sz w:val="22"/>
+                <w:szCs w:val="22"/>
+              </w:rPr>
+            </w:pPr>
+            <w:r>
+              <w:rPr>
+                <w:sz w:val="22"/>
+                <w:szCs w:val="22"/>
+              </w:rPr>
+              <w:t>Flat</w:t>
+            </w:r>
+          </w:p>
+        </w:tc>
+        <w:tc>
+          <w:tcPr>
+            <w:tcW w:w="1790" w:type="dxa"/>
+          </w:tcPr>
+          <w:p>
+            <w:pPr>
+              <w:pStyle w:val="Praca"/>
+              <w:jc w:val="left"/>
+              <w:rPr>
+                <w:sz w:val="22"/>
+                <w:szCs w:val="22"/>
+              </w:rPr>
+            </w:pPr>
+            <w:r>
+              <w:rPr>
+                <w:sz w:val="22"/>
+                <w:szCs w:val="22"/>
+              </w:rPr>
+              <w:t>Baza gotowych modeli, Tworzenie modeli w oparciu o zdjęcia, Baza wtyczek do programu</w:t>
+            </w:r>
+          </w:p>
+        </w:tc>
+      </w:tr>
+      <w:tr>
+        <w:trPr>
+          <w:trHeight w:val="914"/>
+        </w:trPr>
+        <w:tc>
+          <w:tcPr>
+            <w:tcW w:w="1789" w:type="dxa"/>
+          </w:tcPr>
+          <w:p>
+            <w:pPr>
+              <w:pStyle w:val="Praca"/>
+              <w:jc w:val="left"/>
+              <w:rPr>
+                <w:sz w:val="22"/>
+                <w:szCs w:val="22"/>
+              </w:rPr>
+            </w:pPr>
+            <w:r>
+              <w:rPr>
+                <w:sz w:val="22"/>
+                <w:szCs w:val="22"/>
+              </w:rPr>
+              <w:t>Live Home 3D</w:t>
+            </w:r>
+          </w:p>
+        </w:tc>
+        <w:tc>
+          <w:tcPr>
+            <w:tcW w:w="1790" w:type="dxa"/>
+          </w:tcPr>
+          <w:p>
+            <w:pPr>
+              <w:pStyle w:val="Praca"/>
+              <w:jc w:val="left"/>
+              <w:rPr>
+                <w:sz w:val="22"/>
+                <w:szCs w:val="22"/>
+              </w:rPr>
+            </w:pPr>
+            <w:r>
+              <w:rPr>
+                <w:sz w:val="22"/>
+                <w:szCs w:val="22"/>
+              </w:rPr>
+              <w:t>Zakup Jednorazowy</w:t>
+            </w:r>
+          </w:p>
+        </w:tc>
+        <w:tc>
+          <w:tcPr>
+            <w:tcW w:w="1790" w:type="dxa"/>
+          </w:tcPr>
+          <w:p>
+            <w:pPr>
+              <w:pStyle w:val="Praca"/>
+              <w:jc w:val="left"/>
+              <w:rPr>
+                <w:sz w:val="22"/>
+                <w:szCs w:val="22"/>
+              </w:rPr>
+            </w:pPr>
+            <w:r>
+              <w:rPr>
+                <w:sz w:val="22"/>
+                <w:szCs w:val="22"/>
+              </w:rPr>
+              <w:t>Darmowy/$99.99</w:t>
+            </w:r>
+          </w:p>
+        </w:tc>
+        <w:tc>
+          <w:tcPr>
+            <w:tcW w:w="1790" w:type="dxa"/>
+          </w:tcPr>
+          <w:p>
+            <w:pPr>
+              <w:pStyle w:val="Praca"/>
+              <w:jc w:val="left"/>
+              <w:rPr>
+                <w:sz w:val="22"/>
+                <w:szCs w:val="22"/>
+              </w:rPr>
+            </w:pPr>
+            <w:r>
+              <w:rPr>
+                <w:sz w:val="22"/>
+                <w:szCs w:val="22"/>
+              </w:rPr>
+              <w:t>Flat</w:t>
+            </w:r>
+          </w:p>
+        </w:tc>
+        <w:tc>
+          <w:tcPr>
+            <w:tcW w:w="1790" w:type="dxa"/>
+          </w:tcPr>
+          <w:p>
+            <w:pPr>
+              <w:pStyle w:val="Praca"/>
+              <w:jc w:val="left"/>
+              <w:rPr>
+                <w:sz w:val="22"/>
+                <w:szCs w:val="22"/>
+              </w:rPr>
+            </w:pPr>
+            <w:r>
+              <w:rPr>
+                <w:sz w:val="22"/>
+                <w:szCs w:val="22"/>
+              </w:rPr>
+              <w:t>Baza gotowych modeli, importowanie własnych modeli, Dostępne na urządzenia mobilne</w:t>
+            </w:r>
+          </w:p>
+        </w:tc>
+      </w:tr>
+      <w:tr>
+        <w:trPr>
+          <w:trHeight w:val="900"/>
+        </w:trPr>
+        <w:tc>
+          <w:tcPr>
+            <w:tcW w:w="1789" w:type="dxa"/>
+          </w:tcPr>
+          <w:p>
+            <w:pPr>
+              <w:pStyle w:val="Praca"/>
+              <w:jc w:val="left"/>
+              <w:rPr>
+                <w:sz w:val="22"/>
+                <w:szCs w:val="22"/>
+              </w:rPr>
+            </w:pPr>
+            <w:r>
+              <w:rPr>
+                <w:sz w:val="22"/>
+                <w:szCs w:val="22"/>
+              </w:rPr>
+              <w:t>p.Con planner</w:t>
+            </w:r>
+          </w:p>
+        </w:tc>
+        <w:tc>
+          <w:tcPr>
+            <w:tcW w:w="1790" w:type="dxa"/>
+          </w:tcPr>
+          <w:p>
+            <w:pPr>
+              <w:pStyle w:val="Praca"/>
+              <w:jc w:val="left"/>
+              <w:rPr>
+                <w:sz w:val="22"/>
+                <w:szCs w:val="22"/>
+              </w:rPr>
+            </w:pPr>
+            <w:r>
+              <w:rPr>
+                <w:sz w:val="22"/>
+                <w:szCs w:val="22"/>
+              </w:rPr>
+              <w:t>Zakup Jednorazowy</w:t>
+            </w:r>
+          </w:p>
+        </w:tc>
+        <w:tc>
+          <w:tcPr>
+            <w:tcW w:w="1790" w:type="dxa"/>
+          </w:tcPr>
+          <w:p>
+            <w:pPr>
+              <w:pStyle w:val="Praca"/>
+              <w:jc w:val="left"/>
+              <w:rPr>
+                <w:sz w:val="22"/>
+                <w:szCs w:val="22"/>
+              </w:rPr>
+            </w:pPr>
+            <w:r>
+              <w:rPr>
+                <w:sz w:val="22"/>
+                <w:szCs w:val="22"/>
+              </w:rPr>
+              <w:t>Darmowy/19 999 zl</w:t>
+            </w:r>
+          </w:p>
+        </w:tc>
+        <w:tc>
+          <w:tcPr>
+            <w:tcW w:w="1790" w:type="dxa"/>
+          </w:tcPr>
+          <w:p>
+            <w:pPr>
+              <w:pStyle w:val="Praca"/>
+              <w:jc w:val="left"/>
+              <w:rPr>
+                <w:sz w:val="22"/>
+                <w:szCs w:val="22"/>
+              </w:rPr>
+            </w:pPr>
+            <w:r>
+              <w:rPr>
+                <w:sz w:val="22"/>
+                <w:szCs w:val="22"/>
+              </w:rPr>
+              <w:t>Flat/VR</w:t>
+            </w:r>
+          </w:p>
+        </w:tc>
+        <w:tc>
+          <w:tcPr>
+            <w:tcW w:w="1790" w:type="dxa"/>
+          </w:tcPr>
+          <w:p>
+            <w:pPr>
+              <w:pStyle w:val="Praca"/>
+              <w:jc w:val="left"/>
+              <w:rPr>
+                <w:sz w:val="22"/>
+                <w:szCs w:val="22"/>
+              </w:rPr>
+            </w:pPr>
+            <w:r>
+              <w:rPr>
+                <w:sz w:val="22"/>
+                <w:szCs w:val="22"/>
+              </w:rPr>
+              <w:t>Baza gotowych modeli, Wtyczka VR</w:t>
+            </w:r>
+          </w:p>
+        </w:tc>
+      </w:tr>
+    </w:tbl>
+    <w:p>
+      <w:pPr>
+        <w:pStyle w:val="Praca"/>
+      </w:pPr>
+    </w:p>
+    <w:p>
+      <w:pPr>
+        <w:pStyle w:val="Praca"/>
+      </w:pPr>
+      <w:bookmarkStart w:id="2" w:name="_Toc213483044"/>
+      <w:r>
+        <w:lastRenderedPageBreak/>
+        <w:t>Rozwiązania proponowane przez inne firmy często opierają się na opracowaniu planów 2D i późniejszym rozstawieniu mebli w przestrzeni trójwymiarowej. Oferują tworzenie renderów w wysokiej rozdzielczości, ale i również spacery po zaprojektowanych wnętrzach. Niektóre systemu nawet mają wtyczki pozwalające na zobaczenie pomieszczeń w wirtualnej rzeczywistości. Jednak sposób faktycznego projektowania jest praktycznie identyczny dla każdego z tych programów. To co je wyróżnia to oferowane usługi oraz przejrzystość interfejsu użytkownika. Jednakże nawet najprostsze oprogramowanie wymaga wstępnego zapoznania się ze środowiskiem. Nie jest to coś, co zachęca użytkowników, którzy chcą jednorazowo zaplanować swoje mieszkanie. Takie programy są dla ludzi, którzy zajmują się tą tematyką zawodowo lub hobbystycznie.</w:t>
+      </w:r>
+      <w:r>
+        <w:t xml:space="preserve"> </w:t>
+      </w:r>
+      <w:r>
+        <w:t xml:space="preserve">Dla użytkownika, który nie jest zaznajomiony z tą tematyką i chcę tylko zaprojektować swój pokój, zwizualizować swój pomysł to jest bardzo nie przystępne. Choć te programy oferują bogatą funkcjonalność to brakuje im intuicyjności i przystępności. Użytkownik powinien szybko i intuicyjnie móc zaprojektować wnętrze bez wczytywania się w długie strony dokumentacji. Jednakże brak przystępności wynika głównie z specyfiki urządzeń na jakie są produkowane te systemy. Komputery osobiste pozwalają na obsługiwanie dość skomplikowanych programów, co jest ich sporą zaletą, ale dla nowego użytkownika jest to przytłaczające. </w:t>
+      </w:r>
+      <w:r>
+        <w:t>Trzeba nauczyć się posługiwać</w:t>
+      </w:r>
+      <w:r>
+        <w:t xml:space="preserve"> </w:t>
+      </w:r>
+      <w:r>
+        <w:t xml:space="preserve">interfejsem co potrafi być żmudnym zajęciem. To jest cena dużej funkcjonalności, która dla osoby zajmującej się tą tematyką jest warta zapłacenia. Problem ma użytkownik, który albo zaczyna swoją przygodę z projektowaniem wnętrz lub potrzebuje szybko zwizualizować pomysł i nie ma czasu na naukę całego programu. Brakuje systemu, który dzięki swojej prostocie oraz intuicyjności jest w stanie oferować szybką wizualizację projektu oraz pomóc w zaprojektowaniu wnętrza. Taki program powinien być użyteczny dla zwykłego użytkownika, który nie ma doświadczenia z dekorowaniem wnętrz, a chcę zaprojektować swoje mieszkanie. By było to możliwe to sam proces projektowania musi być naturalny dla użytkownika i responsywny. Użytkownik musi w czasie rzeczywistym widzieć swoje działania. </w:t>
+      </w:r>
+      <w:r>
+        <w:t xml:space="preserve">Niestety taki system musiałby zrezygnować z dużej precyzji oraz specyficznej funkcjonalności, kosztem wygody dla użytkownika. Wirtualne projektowanie wnętrz jest rzeczą bardzo potrzebną, ale aktualne rozwiązania wymagają dużej ilości czasu, by móc z nich korzystać w poprawny sposób. </w:t>
+      </w:r>
+      <w:r>
+        <w:t xml:space="preserve">  </w:t>
+      </w:r>
+    </w:p>
+    <w:p>
+      <w:pPr>
+        <w:pStyle w:val="Nagwek2"/>
+      </w:pPr>
+      <w:r>
+        <w:lastRenderedPageBreak/>
+        <w:t>1.2 Wirtualna Rzeczywistość</w:t>
+      </w:r>
+      <w:bookmarkEnd w:id="2"/>
+    </w:p>
+    <w:p>
+      <w:pPr>
+        <w:pStyle w:val="Praca"/>
+        <w:ind w:firstLine="708"/>
+      </w:pPr>
+      <w:r>
+        <w:t xml:space="preserve">Wirtualna rzeczywistość, w skrócie VR, symulacja doświadczenia prawdziwego świata przy pomocy technologii komputerowej. Ma ona symulować trójwymiarowy świat poprzez umieszczenie użytkownika wewnątrz niego. Jest to wykonywane poprzez odpowiednie gogle zakładane na głowę oraz różnego rodzaju kontrolery, które mają przechwytywać ruch użytkownika i przenosić do wirtualnego świata. Zamiast być obserwatorem tego co się dzieje na ekranie, użytkownik jest w pełni czynnym uczestnikiem tego. Wirtualna rzeczywistość ma za zadanie dać użytkownikowi najbardziej naturalne i intuicyjną interakcje z nim. </w:t>
+      </w:r>
+      <w:r>
+        <w:t>VR można łątwo pomylić z AR, MR, czy XR. AR to rozszerzona rzeczywistość, gdzie na realny świat są nakładane cyfrowe obiekty. W przeciwieństwie do VR to rozszerzona rzeczywistość całą swoją magię opiera na wzbogaceniu realnego świata, gdzie w przypadku wirtualnej rzeczywistości jest tworzony zupełnie osobny świat. Połączeniem tych dwóch technologii jest MR, czyli rzeczywistość mieszana. Tak jak w AR na realny świat są nakładane cyfrowe obiekty, ale można z nimi wejść w interakcje na poziomie VR. Można to określić jako bardziej interaktywny AR. XR jest terminem, który określa całe spektrum tych technologii. To co jest wspólnym czynnikiem XR jest danie użytkownikowi nowych doświadczeń rzeczywistości. Może się wydawać, że całe pojęcie XR jest dość nowe. Jednak pierwsze wzmianki o tym sięgają XIX wieku.</w:t>
+      </w:r>
+      <w:r>
+        <w:t xml:space="preserve"> Choć nie można było mówić o VR samym w sobie, to koncept oszukania mózgu, że to co widzi jest </w:t>
+      </w:r>
+      <w:r>
+        <w:t xml:space="preserve">trójwymiarowe było z ludźmi od bardzo dawna. Jednym z pierwszych urządzeń, które miały imitować trójwymiar był stereoskop Wheatstone’a wynaleziony w 1838 roku. </w:t>
+      </w:r>
+    </w:p>
+    <w:p>
+      <w:pPr>
+        <w:pStyle w:val="Praca"/>
+      </w:pPr>
+    </w:p>
+    <w:p>
+      <w:pPr>
+        <w:pStyle w:val="Praca"/>
+        <w:jc w:val="center"/>
+      </w:pPr>
+      <w:r>
+        <w:rPr>
+          <w:noProof/>
+        </w:rPr>
+        <w:drawing>
+          <wp:inline distT="0" distB="0" distL="0" distR="0" wp14:anchorId="2FF5E695" wp14:editId="4A7E3812">
+            <wp:extent cx="3619500" cy="1994494"/>
+            <wp:effectExtent l="0" t="0" r="0" b="6350"/>
+            <wp:docPr id="157571356" name="Obraz 1" descr="Stereoskop lustrzany Sir Charlesa Wheatstona"/>
+            <wp:cNvGraphicFramePr>
+              <a:graphicFrameLocks xmlns:a="http://schemas.openxmlformats.org/drawingml/2006/main" noChangeAspect="1"/>
+            </wp:cNvGraphicFramePr>
+            <a:graphic xmlns:a="http://schemas.openxmlformats.org/drawingml/2006/main">
+              <a:graphicData uri="http://schemas.openxmlformats.org/drawingml/2006/picture">
+                <pic:pic xmlns:pic="http://schemas.openxmlformats.org/drawingml/2006/picture">
+                  <pic:nvPicPr>
+                    <pic:cNvPr id="0" name="Picture 1" descr="Stereoskop lustrzany Sir Charlesa Wheatstona"/>
+                    <pic:cNvPicPr>
+                      <a:picLocks noChangeAspect="1" noChangeArrowheads="1"/>
+                    </pic:cNvPicPr>
+                  </pic:nvPicPr>
+                  <pic:blipFill>
+                    <a:blip r:embed="rId11">
+                      <a:extLst>
+                        <a:ext uri="{28A0092B-C50C-407E-A947-70E740481C1C}">
+                          <a14:useLocalDpi xmlns:a14="http://schemas.microsoft.com/office/drawing/2010/main" val="0"/>
+                        </a:ext>
+                      </a:extLst>
+                    </a:blip>
+                    <a:srcRect/>
+                    <a:stretch>
+                      <a:fillRect/>
+                    </a:stretch>
+                  </pic:blipFill>
+                  <pic:spPr bwMode="auto">
+                    <a:xfrm>
+                      <a:off x="0" y="0"/>
+                      <a:ext cx="3660496" cy="2017085"/>
+                    </a:xfrm>
+                    <a:prstGeom prst="rect">
+                      <a:avLst/>
+                    </a:prstGeom>
+                    <a:noFill/>
+                    <a:ln>
+                      <a:noFill/>
+                    </a:ln>
+                  </pic:spPr>
+                </pic:pic>
+              </a:graphicData>
+            </a:graphic>
+          </wp:inline>
+        </w:drawing>
+      </w:r>
+    </w:p>
+    <w:p>
+      <w:pPr>
+        <w:pStyle w:val="Praca"/>
+        <w:jc w:val="center"/>
+      </w:pPr>
+      <w:r>
+        <w:t>Rys. 1.1 Stereoskop Wheatstone’a</w:t>
+      </w:r>
+    </w:p>
+    <w:p>
+      <w:pPr>
+        <w:pStyle w:val="Praca"/>
+        <w:jc w:val="center"/>
+      </w:pPr>
+    </w:p>
+    <w:p>
+      <w:pPr>
+        <w:pStyle w:val="Praca"/>
+      </w:pPr>
+      <w:r>
+        <w:lastRenderedPageBreak/>
+        <w:t>Urządzenie działało w prosty sposób. Naprzeciw sobie były ustawione dwa takie same obrazy. Pomiędzy nimi były lustra ustawione pod kątek 45 stopni względem obrazów. Obserwator mając założone szkła okularowe mógł obserwować trójwymiarowy obraz. To wszystko było iluzją polegająca na pokazaniu tego samego obrazu, ale pod innym kątem. Jedno oko widziało przedmiot inaczej niż drugie. Mózg to rejestrował i był oszukiwany, że widzi trójwymiarowy obiekt. Na tej zasadzie wszystkie urządzenia VR są oparte. Na iluzji obrazu 3D, poprzez wyświetlanie obrazu inaczej dla każdego oka. To jest tylko jeden zmysł, a co z pozostałymi? Technologia VR przecież polega na oszukiwaniu całego ciała, że znajduje się w wirtualnej przestrzeni. Na przestrzeni lat powstawało kilka urządzeń, które miały oszukiwać te zmysły. Przykładem są symulatory lotów w lat 30. ubiegłego wieku.</w:t>
+      </w:r>
+      <w:r>
+        <w:t xml:space="preserve"> Link trainer miał za zadanie symulować lot samolotem. W tym celu z dużą dokładnością odwzorowywał wskazania instrumentów lotniczych. W czasie II wojny światowej te oto symulatory wytrenowały ponad 500 000 pilotów.</w:t>
+      </w:r>
+    </w:p>
+    <w:p>
+      <w:pPr>
+        <w:pStyle w:val="Praca"/>
+      </w:pPr>
+    </w:p>
+    <w:p>
+      <w:pPr>
+        <w:pStyle w:val="Praca"/>
+        <w:jc w:val="center"/>
+      </w:pPr>
+      <w:r>
+        <w:rPr>
+          <w:noProof/>
+        </w:rPr>
+        <w:drawing>
+          <wp:inline distT="0" distB="0" distL="0" distR="0" wp14:anchorId="4D7D6138" wp14:editId="21F9FDEE">
+            <wp:extent cx="4680585" cy="3616307"/>
+            <wp:effectExtent l="0" t="0" r="5715" b="3810"/>
+            <wp:docPr id="1020685913" name="Obraz 2" descr="undefined"/>
+            <wp:cNvGraphicFramePr>
+              <a:graphicFrameLocks xmlns:a="http://schemas.openxmlformats.org/drawingml/2006/main" noChangeAspect="1"/>
+            </wp:cNvGraphicFramePr>
+            <a:graphic xmlns:a="http://schemas.openxmlformats.org/drawingml/2006/main">
+              <a:graphicData uri="http://schemas.openxmlformats.org/drawingml/2006/picture">
+                <pic:pic xmlns:pic="http://schemas.openxmlformats.org/drawingml/2006/picture">
+                  <pic:nvPicPr>
+                    <pic:cNvPr id="0" name="Picture 3" descr="undefined"/>
+                    <pic:cNvPicPr>
+                      <a:picLocks noChangeAspect="1" noChangeArrowheads="1"/>
+                    </pic:cNvPicPr>
+                  </pic:nvPicPr>
+                  <pic:blipFill>
+                    <a:blip r:embed="rId12">
+                      <a:extLst>
+                        <a:ext uri="{28A0092B-C50C-407E-A947-70E740481C1C}">
+                          <a14:useLocalDpi xmlns:a14="http://schemas.microsoft.com/office/drawing/2010/main" val="0"/>
+                        </a:ext>
+                      </a:extLst>
+                    </a:blip>
+                    <a:srcRect/>
+                    <a:stretch>
+                      <a:fillRect/>
+                    </a:stretch>
+                  </pic:blipFill>
+                  <pic:spPr bwMode="auto">
+                    <a:xfrm>
+                      <a:off x="0" y="0"/>
+                      <a:ext cx="4695432" cy="3627778"/>
+                    </a:xfrm>
+                    <a:prstGeom prst="rect">
+                      <a:avLst/>
+                    </a:prstGeom>
+                    <a:noFill/>
+                    <a:ln>
+                      <a:noFill/>
+                    </a:ln>
+                  </pic:spPr>
+                </pic:pic>
+              </a:graphicData>
+            </a:graphic>
+          </wp:inline>
+        </w:drawing>
+      </w:r>
+    </w:p>
+    <w:p>
+      <w:pPr>
+        <w:pStyle w:val="Praca"/>
+        <w:jc w:val="center"/>
+      </w:pPr>
+      <w:bookmarkStart w:id="3" w:name="_Toc213483045"/>
+      <w:r>
+        <w:t>Rys. 1.2 Link Trainer w użyciu</w:t>
+      </w:r>
+    </w:p>
+    <w:p>
+      <w:pPr>
+        <w:pStyle w:val="Praca"/>
+        <w:jc w:val="center"/>
+      </w:pPr>
+    </w:p>
+    <w:p>
+      <w:pPr>
+        <w:pStyle w:val="Praca"/>
+        <w:jc w:val="center"/>
+      </w:pPr>
+    </w:p>
+    <w:p>
+      <w:pPr>
+        <w:pStyle w:val="Praca"/>
+      </w:pPr>
+      <w:r>
+        <w:lastRenderedPageBreak/>
+        <w:t>Sama ta technologia tylko ilustruje to jak ludzie na wiele sposobów próbowali oszukiwać ludzi, by mieli wrażenie, że są w innym miejscu niż faktycznie są. Leży to u podstaw konceptu wirtualnej rzeczywistości. W takim razie co było pierwszym urządzeniem, które w pełni realizowało założenia wirtualnej rzeczywistości? W 1962 roku Morton Heiling zaprezentował światu Sensoramę.</w:t>
+      </w:r>
+      <w:r>
+        <w:t xml:space="preserve"> Można ją porównać do wyświetlania filmów w 4D. Urządzenie miało stymulować każdy zmysł człowieka. Widz mógł poczuć się jak uczestnik filmu. Przykładał on głowię do urządzenia i oglądał specjalnie nakręcone filmy. W tym czasie mógł słyszeć dźwięk w stereo, co było coś nowe w tamtych czasach. Dodatkowo mógł poczuć róźnego rodzaju zapach oraz sam fotel miał się przechylać i wibrować, by symulować zdarzenia dziejące się na filmie. Sensorama przenosiła widza w zupełnie inny świat oszukując każdy jego zmysł. Choć nadal brakowało tutaj interaktywności to ten wynalazek można określić jako pierwsze urządzenie VR.</w:t>
+      </w:r>
+    </w:p>
+    <w:p>
+      <w:pPr>
+        <w:pStyle w:val="Praca"/>
+        <w:jc w:val="center"/>
+      </w:pPr>
+      <w:r>
+        <w:rPr>
+          <w:noProof/>
+        </w:rPr>
+        <w:drawing>
+          <wp:inline distT="0" distB="0" distL="0" distR="0" wp14:anchorId="2B916D6D" wp14:editId="72E5F4F4">
+            <wp:extent cx="3375660" cy="4322244"/>
+            <wp:effectExtent l="0" t="0" r="0" b="2540"/>
+            <wp:docPr id="681116807" name="Obraz 3" descr="The Sensorama: One of the First Functioning Efforts in ..."/>
+            <wp:cNvGraphicFramePr>
+              <a:graphicFrameLocks xmlns:a="http://schemas.openxmlformats.org/drawingml/2006/main" noChangeAspect="1"/>
+            </wp:cNvGraphicFramePr>
+            <a:graphic xmlns:a="http://schemas.openxmlformats.org/drawingml/2006/main">
+              <a:graphicData uri="http://schemas.openxmlformats.org/drawingml/2006/picture">
+                <pic:pic xmlns:pic="http://schemas.openxmlformats.org/drawingml/2006/picture">
+                  <pic:nvPicPr>
+                    <pic:cNvPr id="0" name="Picture 5" descr="The Sensorama: One of the First Functioning Efforts in ..."/>
+                    <pic:cNvPicPr>
+                      <a:picLocks noChangeAspect="1" noChangeArrowheads="1"/>
+                    </pic:cNvPicPr>
+                  </pic:nvPicPr>
+                  <pic:blipFill>
+                    <a:blip r:embed="rId13">
+                      <a:extLst>
+                        <a:ext uri="{28A0092B-C50C-407E-A947-70E740481C1C}">
+                          <a14:useLocalDpi xmlns:a14="http://schemas.microsoft.com/office/drawing/2010/main" val="0"/>
+                        </a:ext>
+                      </a:extLst>
+                    </a:blip>
+                    <a:srcRect/>
+                    <a:stretch>
+                      <a:fillRect/>
+                    </a:stretch>
+                  </pic:blipFill>
+                  <pic:spPr bwMode="auto">
+                    <a:xfrm>
+                      <a:off x="0" y="0"/>
+                      <a:ext cx="3383653" cy="4332478"/>
+                    </a:xfrm>
+                    <a:prstGeom prst="rect">
+                      <a:avLst/>
+                    </a:prstGeom>
+                    <a:noFill/>
+                    <a:ln>
+                      <a:noFill/>
+                    </a:ln>
+                  </pic:spPr>
+                </pic:pic>
+              </a:graphicData>
+            </a:graphic>
+          </wp:inline>
+        </w:drawing>
+      </w:r>
+    </w:p>
+    <w:p>
+      <w:pPr>
+        <w:pStyle w:val="Praca"/>
+        <w:jc w:val="center"/>
+      </w:pPr>
+      <w:r>
+        <w:t>Rys 1.3 Sensorama</w:t>
+      </w:r>
+    </w:p>
+    <w:p>
+      <w:pPr>
+        <w:pStyle w:val="Praca"/>
+        <w:jc w:val="center"/>
+      </w:pPr>
+    </w:p>
+    <w:p>
+      <w:pPr>
+        <w:pStyle w:val="Praca"/>
+        <w:jc w:val="center"/>
+      </w:pPr>
+    </w:p>
+    <w:p>
+      <w:pPr>
+        <w:pStyle w:val="Praca"/>
+        <w:jc w:val="center"/>
+      </w:pPr>
+    </w:p>
+    <w:p>
+      <w:pPr>
+        <w:pStyle w:val="Praca"/>
+      </w:pPr>
+      <w:r>
+        <w:lastRenderedPageBreak/>
+        <w:t xml:space="preserve">Używając Sensoramy widz był nieruchomy, co jest bardzo dalekie od tego jak dziś wygląda VR. Kojarzymy często tę technologię z goglami zakładanymi na głowę. W 1961 roku firma Philco stworzyła hełm, który nie dość, że wyświetlał obraz ale jeszcze był zdolny do śledzenia ruchów użytkownika. Te informacje były przekazywane zdalnie do oddalonej kamery, której obraz był wyświetlany na hełmie. Urządzenie było stworzone, by umożliwić zdalną obserwacje niebezpiecznych miejsc. Ostatecznie hełmy były używane przez wojsko w celach treningowych. Choć nie wyświetlały one wirtualnego świata to jednak ich działanie było sporym krokiem dla VR jakie dzisiaj znamy. </w:t>
+      </w:r>
+    </w:p>
+    <w:p>
+      <w:pPr>
+        <w:pStyle w:val="Praca"/>
+        <w:jc w:val="center"/>
+      </w:pPr>
+      <w:r>
+        <w:rPr>
+          <w:noProof/>
+        </w:rPr>
+        <w:drawing>
+          <wp:inline distT="0" distB="0" distL="0" distR="0" wp14:anchorId="5B505538" wp14:editId="675059FD">
+            <wp:extent cx="3589020" cy="5024710"/>
+            <wp:effectExtent l="0" t="0" r="0" b="5080"/>
+            <wp:docPr id="1001033854" name="Obraz 4" descr="Philco Headsight (1961)"/>
+            <wp:cNvGraphicFramePr>
+              <a:graphicFrameLocks xmlns:a="http://schemas.openxmlformats.org/drawingml/2006/main" noChangeAspect="1"/>
+            </wp:cNvGraphicFramePr>
+            <a:graphic xmlns:a="http://schemas.openxmlformats.org/drawingml/2006/main">
+              <a:graphicData uri="http://schemas.openxmlformats.org/drawingml/2006/picture">
+                <pic:pic xmlns:pic="http://schemas.openxmlformats.org/drawingml/2006/picture">
+                  <pic:nvPicPr>
+                    <pic:cNvPr id="0" name="Picture 7" descr="Philco Headsight (1961)"/>
+                    <pic:cNvPicPr>
+                      <a:picLocks noChangeAspect="1" noChangeArrowheads="1"/>
+                    </pic:cNvPicPr>
+                  </pic:nvPicPr>
+                  <pic:blipFill>
+                    <a:blip r:embed="rId14">
+                      <a:extLst>
+                        <a:ext uri="{28A0092B-C50C-407E-A947-70E740481C1C}">
+                          <a14:useLocalDpi xmlns:a14="http://schemas.microsoft.com/office/drawing/2010/main" val="0"/>
+                        </a:ext>
+                      </a:extLst>
+                    </a:blip>
+                    <a:srcRect/>
+                    <a:stretch>
+                      <a:fillRect/>
+                    </a:stretch>
+                  </pic:blipFill>
+                  <pic:spPr bwMode="auto">
+                    <a:xfrm>
+                      <a:off x="0" y="0"/>
+                      <a:ext cx="3595094" cy="5033214"/>
+                    </a:xfrm>
+                    <a:prstGeom prst="rect">
+                      <a:avLst/>
+                    </a:prstGeom>
+                    <a:noFill/>
+                    <a:ln>
+                      <a:noFill/>
+                    </a:ln>
+                  </pic:spPr>
+                </pic:pic>
+              </a:graphicData>
+            </a:graphic>
+          </wp:inline>
+        </w:drawing>
+      </w:r>
+    </w:p>
+    <w:p>
+      <w:pPr>
+        <w:pStyle w:val="Praca"/>
+        <w:jc w:val="center"/>
+      </w:pPr>
+      <w:r>
+        <w:t>Rys. 1.4 Philco Headsight</w:t>
+      </w:r>
+    </w:p>
+    <w:p>
+      <w:pPr>
+        <w:pStyle w:val="Praca"/>
+        <w:jc w:val="center"/>
+      </w:pPr>
+    </w:p>
+    <w:p>
+      <w:pPr>
+        <w:pStyle w:val="Praca"/>
+        <w:jc w:val="center"/>
+      </w:pPr>
+    </w:p>
+    <w:p>
+      <w:pPr>
+        <w:pStyle w:val="Praca"/>
+        <w:jc w:val="center"/>
+      </w:pPr>
+    </w:p>
+    <w:p>
+      <w:pPr>
+        <w:pStyle w:val="Praca"/>
+        <w:jc w:val="center"/>
+      </w:pPr>
+    </w:p>
+    <w:p>
+      <w:pPr>
+        <w:pStyle w:val="Praca"/>
+      </w:pPr>
+      <w:r>
+        <w:lastRenderedPageBreak/>
+        <w:t xml:space="preserve">Innym pionierem w tej dziedzinie był miecz damoklesa. W latach 60 Ivan Sutherland stworzył gogle, które nie dość że śledziły ruch głowy, ale i również wyświetlały grafikę komputerową. Gogle były przymocowane do dużego </w:t>
+      </w:r>
+      <w:r>
+        <w:t>ramienia, dlatego to urządzenie żartobliwie zostało przez twórce nazwane mieczem Damoklesa, choć lepszym określeniem był Head-mounted Display, co można przetłumaczyć na ekran zamocowany na głowie. I to urządzenie można faktycznie nazwać pierwszym zestawem do VR, ponieważ użytkownik mógł wejść do wirtualnego świata i jednocześnie rozglądać się po nim. Oczywiście była to bardzo uproszczona wersja wirtualnej rzeczywistości, gdzie użytkownik nie miał większego wpływu na świat wyświetlany przed jego oczami.</w:t>
+      </w:r>
+    </w:p>
+    <w:p>
+      <w:pPr>
+        <w:pStyle w:val="Praca"/>
+        <w:jc w:val="center"/>
+      </w:pPr>
+      <w:r>
+        <w:rPr>
+          <w:noProof/>
+        </w:rPr>
+        <w:drawing>
+          <wp:inline distT="0" distB="0" distL="0" distR="0" wp14:anchorId="14083CA4" wp14:editId="07F0A513">
+            <wp:extent cx="5567490" cy="4038600"/>
+            <wp:effectExtent l="0" t="0" r="0" b="0"/>
+            <wp:docPr id="1674272965" name="Obraz 5" descr="The Sword of Damocles (1968)"/>
+            <wp:cNvGraphicFramePr>
+              <a:graphicFrameLocks xmlns:a="http://schemas.openxmlformats.org/drawingml/2006/main" noChangeAspect="1"/>
+            </wp:cNvGraphicFramePr>
+            <a:graphic xmlns:a="http://schemas.openxmlformats.org/drawingml/2006/main">
+              <a:graphicData uri="http://schemas.openxmlformats.org/drawingml/2006/picture">
+                <pic:pic xmlns:pic="http://schemas.openxmlformats.org/drawingml/2006/picture">
+                  <pic:nvPicPr>
+                    <pic:cNvPr id="0" name="Picture 9" descr="The Sword of Damocles (1968)"/>
+                    <pic:cNvPicPr>
+                      <a:picLocks noChangeAspect="1" noChangeArrowheads="1"/>
+                    </pic:cNvPicPr>
+                  </pic:nvPicPr>
+                  <pic:blipFill>
+                    <a:blip r:embed="rId15">
+                      <a:extLst>
+                        <a:ext uri="{28A0092B-C50C-407E-A947-70E740481C1C}">
+                          <a14:useLocalDpi xmlns:a14="http://schemas.microsoft.com/office/drawing/2010/main" val="0"/>
+                        </a:ext>
+                      </a:extLst>
+                    </a:blip>
+                    <a:srcRect/>
+                    <a:stretch>
+                      <a:fillRect/>
+                    </a:stretch>
+                  </pic:blipFill>
+                  <pic:spPr bwMode="auto">
+                    <a:xfrm>
+                      <a:off x="0" y="0"/>
+                      <a:ext cx="5582733" cy="4049657"/>
+                    </a:xfrm>
+                    <a:prstGeom prst="rect">
+                      <a:avLst/>
+                    </a:prstGeom>
+                    <a:noFill/>
+                    <a:ln>
+                      <a:noFill/>
+                    </a:ln>
+                  </pic:spPr>
+                </pic:pic>
+              </a:graphicData>
+            </a:graphic>
+          </wp:inline>
+        </w:drawing>
+      </w:r>
+    </w:p>
+    <w:p>
+      <w:pPr>
+        <w:pStyle w:val="Praca"/>
+        <w:jc w:val="center"/>
+      </w:pPr>
+      <w:r>
+        <w:t>Rys. 1.5 Miecz Damoklesa</w:t>
+      </w:r>
+    </w:p>
+    <w:p>
+      <w:pPr>
+        <w:pStyle w:val="Praca"/>
+        <w:jc w:val="center"/>
+      </w:pPr>
+    </w:p>
+    <w:p>
+      <w:pPr>
+        <w:pStyle w:val="Praca"/>
+        <w:jc w:val="center"/>
+      </w:pPr>
+    </w:p>
+    <w:p>
+      <w:pPr>
+        <w:pStyle w:val="Praca"/>
+        <w:jc w:val="center"/>
+      </w:pPr>
+    </w:p>
+    <w:p>
+      <w:pPr>
+        <w:pStyle w:val="Praca"/>
+        <w:jc w:val="center"/>
+      </w:pPr>
+    </w:p>
+    <w:p>
+      <w:pPr>
+        <w:pStyle w:val="Praca"/>
+        <w:jc w:val="center"/>
+      </w:pPr>
+    </w:p>
+    <w:p>
+      <w:pPr>
+        <w:pStyle w:val="Praca"/>
+        <w:jc w:val="center"/>
+      </w:pPr>
+    </w:p>
+    <w:p>
+      <w:pPr>
+        <w:pStyle w:val="Praca"/>
+        <w:jc w:val="center"/>
+      </w:pPr>
+    </w:p>
+    <w:p>
+      <w:pPr>
+        <w:pStyle w:val="Praca"/>
+      </w:pPr>
+      <w:r>
+        <w:lastRenderedPageBreak/>
+        <w:t xml:space="preserve">Lekkim przełomem w historii wirtualnej rzeczywistości były technologie opracowane w latach 80 zeszłego wieku przez firmę VPL. Nie dość, że opracowali kolejne gogle do wyświetlania grafiki komputerowej to dodatkowo zajmowali się aspektem interaktywnym wirtualnej rzeczywistości. Opracowali oni DataGlove, czyli rękawice, które śledziły ruch rąk i przesyłały te dane do komputera. W wyniku czego można było zaobserwować interakcje między człowiekiem, a obiektem na ekranie. Nawet dziś zakres działana rękawic są imponujące, bo nie dość, że wykrywały obrót we wszystkich osiach to jeszcze miała możliwość wykrycia </w:t>
+      </w:r>
+      <w:r>
+        <w:t xml:space="preserve">wygięcia palców. </w:t>
+      </w:r>
+      <w:r>
+        <w:t>Ta konkretna technologia została później wykorzystana do stworzenia Power Glove przez firmę Mattel.</w:t>
+      </w:r>
+    </w:p>
+    <w:p>
+      <w:pPr>
+        <w:pStyle w:val="Praca"/>
+        <w:jc w:val="center"/>
+      </w:pPr>
+      <w:r>
+        <w:rPr>
+          <w:noProof/>
+        </w:rPr>
+        <w:drawing>
+          <wp:inline distT="0" distB="0" distL="0" distR="0" wp14:anchorId="29551183" wp14:editId="63D566A2">
+            <wp:extent cx="5579745" cy="2606040"/>
+            <wp:effectExtent l="0" t="0" r="1905" b="3810"/>
+            <wp:docPr id="450891158" name="Obraz 6" descr="undefined"/>
+            <wp:cNvGraphicFramePr>
+              <a:graphicFrameLocks xmlns:a="http://schemas.openxmlformats.org/drawingml/2006/main" noChangeAspect="1"/>
+            </wp:cNvGraphicFramePr>
+            <a:graphic xmlns:a="http://schemas.openxmlformats.org/drawingml/2006/main">
+              <a:graphicData uri="http://schemas.openxmlformats.org/drawingml/2006/picture">
+                <pic:pic xmlns:pic="http://schemas.openxmlformats.org/drawingml/2006/picture">
+                  <pic:nvPicPr>
+                    <pic:cNvPr id="0" name="Picture 11" descr="undefined"/>
+                    <pic:cNvPicPr>
+                      <a:picLocks noChangeAspect="1" noChangeArrowheads="1"/>
+                    </pic:cNvPicPr>
+                  </pic:nvPicPr>
+                  <pic:blipFill>
+                    <a:blip r:embed="rId16" cstate="print">
+                      <a:extLst>
+                        <a:ext uri="{28A0092B-C50C-407E-A947-70E740481C1C}">
+                          <a14:useLocalDpi xmlns:a14="http://schemas.microsoft.com/office/drawing/2010/main" val="0"/>
+                        </a:ext>
+                      </a:extLst>
+                    </a:blip>
+                    <a:srcRect/>
+                    <a:stretch>
+                      <a:fillRect/>
+                    </a:stretch>
+                  </pic:blipFill>
+                  <pic:spPr bwMode="auto">
+                    <a:xfrm>
+                      <a:off x="0" y="0"/>
+                      <a:ext cx="5579745" cy="2606040"/>
+                    </a:xfrm>
+                    <a:prstGeom prst="rect">
+                      <a:avLst/>
+                    </a:prstGeom>
+                    <a:noFill/>
+                    <a:ln>
+                      <a:noFill/>
+                    </a:ln>
+                  </pic:spPr>
+                </pic:pic>
+              </a:graphicData>
+            </a:graphic>
+          </wp:inline>
+        </w:drawing>
+      </w:r>
+    </w:p>
+    <w:p>
+      <w:pPr>
+        <w:pStyle w:val="Praca"/>
+        <w:jc w:val="center"/>
+      </w:pPr>
+      <w:r>
+        <w:t>Rys. 1.6 Power Glove</w:t>
+      </w:r>
+    </w:p>
+    <w:p>
+      <w:pPr>
+        <w:pStyle w:val="Praca"/>
+      </w:pPr>
+      <w:r>
+        <w:t xml:space="preserve">Rękawice były bardzo uproszczoną wersją DataGlove, bo nie wykrywał obrotu we wszystkich osiach, ale </w:t>
+      </w:r>
+      <w:r>
+        <w:t>nie przeszkodziło to w byciu komercjalnym sukcesem. Niestety dobra sprzedaż nie była wyznacznikiem jakości, ponieważ osoby używające sprzętu skarżyły się na toporność w obsłudze gier, a sama ilość produkcji stworzonych na potrzeby tej rękawicy nie była spora.</w:t>
+      </w:r>
+      <w:r>
+        <w:t xml:space="preserve"> </w:t>
+      </w:r>
+      <w:r>
+        <w:t xml:space="preserve">Power Glove pomimo fatalnej jakości stała się po części ikoną wyobrażeń o futurystycznej przyszłości. </w:t>
+      </w:r>
+      <w:r>
+        <w:t>Firma VPL również opracowała</w:t>
+      </w:r>
+      <w:r>
+        <w:t xml:space="preserve"> strój na całe ciało, które było w stanie rejestrować ruch całego ciała. Można to porównać do strojów używanych do motion capture.</w:t>
+      </w:r>
+    </w:p>
+    <w:p>
+      <w:pPr>
+        <w:pStyle w:val="Praca"/>
+        <w:jc w:val="center"/>
+      </w:pPr>
+      <w:r>
+        <w:rPr>
+          <w:noProof/>
+        </w:rPr>
+        <w:lastRenderedPageBreak/>
+        <w:drawing>
+          <wp:inline distT="0" distB="0" distL="0" distR="0" wp14:anchorId="697FF2CB" wp14:editId="39C56785">
+            <wp:extent cx="2232660" cy="4632562"/>
+            <wp:effectExtent l="0" t="0" r="0" b="0"/>
+            <wp:docPr id="91802097" name="Obraz 7" descr="undefined"/>
+            <wp:cNvGraphicFramePr>
+              <a:graphicFrameLocks xmlns:a="http://schemas.openxmlformats.org/drawingml/2006/main" noChangeAspect="1"/>
+            </wp:cNvGraphicFramePr>
+            <a:graphic xmlns:a="http://schemas.openxmlformats.org/drawingml/2006/main">
+              <a:graphicData uri="http://schemas.openxmlformats.org/drawingml/2006/picture">
+                <pic:pic xmlns:pic="http://schemas.openxmlformats.org/drawingml/2006/picture">
+                  <pic:nvPicPr>
+                    <pic:cNvPr id="0" name="Picture 13" descr="undefined"/>
+                    <pic:cNvPicPr>
+                      <a:picLocks noChangeAspect="1" noChangeArrowheads="1"/>
+                    </pic:cNvPicPr>
+                  </pic:nvPicPr>
+                  <pic:blipFill>
+                    <a:blip r:embed="rId17" cstate="print">
+                      <a:extLst>
+                        <a:ext uri="{28A0092B-C50C-407E-A947-70E740481C1C}">
+                          <a14:useLocalDpi xmlns:a14="http://schemas.microsoft.com/office/drawing/2010/main" val="0"/>
+                        </a:ext>
+                      </a:extLst>
+                    </a:blip>
+                    <a:srcRect/>
+                    <a:stretch>
+                      <a:fillRect/>
+                    </a:stretch>
+                  </pic:blipFill>
+                  <pic:spPr bwMode="auto">
+                    <a:xfrm>
+                      <a:off x="0" y="0"/>
+                      <a:ext cx="2238120" cy="4643891"/>
+                    </a:xfrm>
+                    <a:prstGeom prst="rect">
+                      <a:avLst/>
+                    </a:prstGeom>
+                    <a:noFill/>
+                    <a:ln>
+                      <a:noFill/>
+                    </a:ln>
+                  </pic:spPr>
+                </pic:pic>
+              </a:graphicData>
+            </a:graphic>
+          </wp:inline>
+        </w:drawing>
+      </w:r>
+    </w:p>
+    <w:p>
+      <w:pPr>
+        <w:pStyle w:val="Praca"/>
+        <w:jc w:val="center"/>
+      </w:pPr>
+      <w:r>
+        <w:t>Rys. 1.7 Strój na całe ciało opracowane przez VPL</w:t>
+      </w:r>
+    </w:p>
+    <w:p>
+      <w:pPr>
+        <w:pStyle w:val="Praca"/>
+      </w:pPr>
+      <w:r>
+        <w:t xml:space="preserve">Niestety VPL zbankrutowało pod koniec lat 80. zeszłego wieku. Powodów można się doszukiwać wszędzie, ale głównym problemem okazała się sama technologia. Była ona zbyt droga, a jednocześnie zbyt prymitywna. Ich gogle </w:t>
+      </w:r>
+      <w:r>
+        <w:t>choć imponowały pomysłem to były zbyt mało wydajne. Obraz mógł wyświetlać tylko 6 klatek na sekundę, gdzie już telewizory z tamtego okresy bez problemu wyświetlały 30 klatek.</w:t>
+      </w:r>
+      <w:r>
+        <w:t xml:space="preserve"> To jednak nie zatrzymało postępu i w 1991 do salonów gier zawitały maszyny Virtuality. To były dość spore maszyny, które pozwalały wejść w świat wirtualnej rzeczywistości. Pierwsza wersja określona jako 1000</w:t>
+      </w:r>
+      <w:r>
+        <w:t>CS</w:t>
+      </w:r>
+      <w:r>
+        <w:t xml:space="preserve"> oferowała gogle oraz kontrolery ruchowe. Zagrać można było w mały katalog gier przeznaczonych na wirtualną rzeczywistość. To co było wyjątkowo to możliwość grania z innymi osobami. Automaty oferowały wspólnie granie w wybranych grach. Grafika była prosta, ale można już mówić o faktycznym VR. Późniejsze wersje automatu(1000SD, 2000, 3000) oferowały lepsze podzespoły oraz lepszą rozdzielczość ekranów. Dla porównania wersja 1000</w:t>
+      </w:r>
+      <w:r>
+        <w:t>CS</w:t>
+      </w:r>
+      <w:r>
+        <w:t xml:space="preserve"> miała w goglach dwa ekrany LCD o rozdzielczości 372x250, gdzie wersja 2000 już miała 800x600. </w:t>
+      </w:r>
+      <w:r>
+        <w:lastRenderedPageBreak/>
+        <w:t>Widać, było że ta technologia ma duże zastosowanie w rozrywce i do takich zastosowań późniejsze wersje tej technologii będą tworzone.</w:t>
+      </w:r>
+    </w:p>
+    <w:p>
+      <w:pPr>
+        <w:pStyle w:val="Praca"/>
+        <w:jc w:val="center"/>
+      </w:pPr>
+      <w:r>
+        <w:rPr>
+          <w:noProof/>
+        </w:rPr>
+        <w:drawing>
+          <wp:inline distT="0" distB="0" distL="0" distR="0" wp14:anchorId="02036334" wp14:editId="4528299E">
+            <wp:extent cx="4046220" cy="5563955"/>
+            <wp:effectExtent l="0" t="0" r="0" b="0"/>
+            <wp:docPr id="2028102586" name="Obraz 8" descr="undefined"/>
+            <wp:cNvGraphicFramePr>
+              <a:graphicFrameLocks xmlns:a="http://schemas.openxmlformats.org/drawingml/2006/main" noChangeAspect="1"/>
+            </wp:cNvGraphicFramePr>
+            <a:graphic xmlns:a="http://schemas.openxmlformats.org/drawingml/2006/main">
+              <a:graphicData uri="http://schemas.openxmlformats.org/drawingml/2006/picture">
+                <pic:pic xmlns:pic="http://schemas.openxmlformats.org/drawingml/2006/picture">
+                  <pic:nvPicPr>
+                    <pic:cNvPr id="0" name="Picture 15" descr="undefined"/>
+                    <pic:cNvPicPr>
+                      <a:picLocks noChangeAspect="1" noChangeArrowheads="1"/>
+                    </pic:cNvPicPr>
+                  </pic:nvPicPr>
+                  <pic:blipFill>
+                    <a:blip r:embed="rId18">
+                      <a:extLst>
+                        <a:ext uri="{28A0092B-C50C-407E-A947-70E740481C1C}">
+                          <a14:useLocalDpi xmlns:a14="http://schemas.microsoft.com/office/drawing/2010/main" val="0"/>
+                        </a:ext>
+                      </a:extLst>
+                    </a:blip>
+                    <a:srcRect/>
+                    <a:stretch>
+                      <a:fillRect/>
+                    </a:stretch>
+                  </pic:blipFill>
+                  <pic:spPr bwMode="auto">
+                    <a:xfrm>
+                      <a:off x="0" y="0"/>
+                      <a:ext cx="4053962" cy="5574601"/>
+                    </a:xfrm>
+                    <a:prstGeom prst="rect">
+                      <a:avLst/>
+                    </a:prstGeom>
+                    <a:noFill/>
+                    <a:ln>
+                      <a:noFill/>
+                    </a:ln>
+                  </pic:spPr>
+                </pic:pic>
+              </a:graphicData>
+            </a:graphic>
+          </wp:inline>
+        </w:drawing>
+      </w:r>
+    </w:p>
+    <w:p>
+      <w:pPr>
+        <w:pStyle w:val="Praca"/>
+        <w:jc w:val="center"/>
+      </w:pPr>
+      <w:r>
+        <w:t>Rys. 1.8 Virtuality 1000CS</w:t>
+      </w:r>
+    </w:p>
+    <w:p>
+      <w:pPr>
+        <w:pStyle w:val="Praca"/>
+        <w:jc w:val="center"/>
+      </w:pPr>
+      <w:r>
+        <w:rPr>
+          <w:noProof/>
+        </w:rPr>
+        <w:lastRenderedPageBreak/>
+        <w:drawing>
+          <wp:inline distT="0" distB="0" distL="0" distR="0" wp14:anchorId="26663A02" wp14:editId="3E5C1FC6">
+            <wp:extent cx="5036820" cy="5135880"/>
+            <wp:effectExtent l="0" t="0" r="0" b="7620"/>
+            <wp:docPr id="928328142" name="Obraz 9" descr="undefined"/>
+            <wp:cNvGraphicFramePr>
+              <a:graphicFrameLocks xmlns:a="http://schemas.openxmlformats.org/drawingml/2006/main" noChangeAspect="1"/>
+            </wp:cNvGraphicFramePr>
+            <a:graphic xmlns:a="http://schemas.openxmlformats.org/drawingml/2006/main">
+              <a:graphicData uri="http://schemas.openxmlformats.org/drawingml/2006/picture">
+                <pic:pic xmlns:pic="http://schemas.openxmlformats.org/drawingml/2006/picture">
+                  <pic:nvPicPr>
+                    <pic:cNvPr id="0" name="Picture 17" descr="undefined"/>
+                    <pic:cNvPicPr>
+                      <a:picLocks noChangeAspect="1" noChangeArrowheads="1"/>
+                    </pic:cNvPicPr>
+                  </pic:nvPicPr>
+                  <pic:blipFill>
+                    <a:blip r:embed="rId19">
+                      <a:extLst>
+                        <a:ext uri="{28A0092B-C50C-407E-A947-70E740481C1C}">
+                          <a14:useLocalDpi xmlns:a14="http://schemas.microsoft.com/office/drawing/2010/main" val="0"/>
+                        </a:ext>
+                      </a:extLst>
+                    </a:blip>
+                    <a:srcRect/>
+                    <a:stretch>
+                      <a:fillRect/>
+                    </a:stretch>
+                  </pic:blipFill>
+                  <pic:spPr bwMode="auto">
+                    <a:xfrm>
+                      <a:off x="0" y="0"/>
+                      <a:ext cx="5036820" cy="5135880"/>
+                    </a:xfrm>
+                    <a:prstGeom prst="rect">
+                      <a:avLst/>
+                    </a:prstGeom>
+                    <a:noFill/>
+                    <a:ln>
+                      <a:noFill/>
+                    </a:ln>
+                  </pic:spPr>
+                </pic:pic>
+              </a:graphicData>
+            </a:graphic>
+          </wp:inline>
+        </w:drawing>
+      </w:r>
+    </w:p>
+    <w:p>
+      <w:pPr>
+        <w:pStyle w:val="Praca"/>
+        <w:jc w:val="center"/>
+      </w:pPr>
+      <w:r>
+        <w:t>Rys. 1.9 Virtuality 2000SU</w:t>
+      </w:r>
+    </w:p>
+    <w:p>
+      <w:pPr>
+        <w:pStyle w:val="Praca"/>
+      </w:pPr>
+      <w:r>
+        <w:t>Automaty Virtuality były bardziej nastawione na salony gier niż na zwykłego konsumenta to by wypełnić tą niszę dwie firmy postanowiły stworzyć własne gogle do wirtualnej rzeczywistości. Tymi firmami była Sega oraz Nintendo. Pierwsza firma chciała stworzyć dodatek do swojej konsoli: Sega Genesis. Miały to być gogle pozwalające zanurzyć się w cyfrowym świecie. Koszt tych gogli miał wynosić aż 200 dolarów co po uwzględnieniu inflacji wynosi aż 446 dolarów. Prototypy tych gogli były pokazywana na różnych wydarzeniach, ale ostatecznie projekt został skasowany. Powodem były problemy z chorobą lokomocyjną.</w:t>
+      </w:r>
+      <w:r>
+        <w:t xml:space="preserve"> I niestety ten problem dotyczy również dzisiejszych sprzętów, ale udało się zrozumieć przyczyny występowania tej choroby oraz wymyślono sposoby, by ją złagodzić. Choroba symulatorowa, bo tak jest dziś określana, występuje gdy oczy widzą ruch, a reszta ciała tego nie rejestruje. Przykładowo w grze gracz porusza się z dużą prędkością, ale on sam w rzeczywistym świecie stoi w bez ruchu. Gracz </w:t>
+      </w:r>
+      <w:r>
+        <w:t xml:space="preserve"> </w:t>
+      </w:r>
+      <w:r>
+        <w:lastRenderedPageBreak/>
+        <w:t>może wtedy poczuć się jak podczas choroby lokomocyjnej. Może zacząć mu się robić słabo lub w ekstremalnych przypadkach wymiotować. Dzisiaj twórcy oprogramowania tworzą specjalne ustawienia, które mają za zadanie zm</w:t>
+      </w:r>
+      <w:r>
+        <w:t>n</w:t>
+      </w:r>
+      <w:r>
+        <w:t>iejszyć wpł</w:t>
+      </w:r>
+      <w:r>
+        <w:t>yw tej choroby. Częstym środkiem zaradczym jest winieta ustawiona na ekran oraz możliwość poruszania się przy pomocy teleportacji. Jednakże największym czynnikiem, który wpływa na występowanie tej choroby to ilość klatek na sekundę. Za mała liczba zwiększa szanse na pojawienie się objawów choroby symulacyjnej. I ten powód mógł być główną przyczyną dlaczego gogle Segi zostały skasowane. Moc obliczeniowa konsoli nie mogła dać wystarczającej ilości klatek na sekundę w grach. Nintendo z drugiej strony podeszło do tematu wirtualnej rzeczywistości bardziej zachowawczo oferując bardzo prymitywną grafikę oraz bardzo ograniczoną interakcję. Zamiast gogli użytkownik dostawał stacjonarny ekran do którego trzeba było przy</w:t>
+      </w:r>
+      <w:r>
+        <w:t>łożyć głowę. Grafika prezentowana przez to urządzenie była bardzo uproszczona, składająca się z czerwonych diod ekrany pokazywały grafikę 3D. Lecz tylko w kolorze czerwonym. Produkt został wydany w 1995 i okazał się finansową klapą. Ludzie skarżyli się na bóle głowy, a dość niewygodny stelaż powodował, że granie w gry na tej platformie było uciążliwe.</w:t>
+      </w:r>
+    </w:p>
+    <w:p>
+      <w:pPr>
+        <w:pStyle w:val="Praca"/>
+        <w:jc w:val="center"/>
+      </w:pPr>
+      <w:r>
+        <w:rPr>
+          <w:noProof/>
+        </w:rPr>
+        <w:drawing>
+          <wp:inline distT="0" distB="0" distL="0" distR="0" wp14:anchorId="3C9FDC3C" wp14:editId="6AE71538">
+            <wp:extent cx="4102520" cy="3276600"/>
+            <wp:effectExtent l="0" t="0" r="0" b="0"/>
+            <wp:docPr id="1937715201" name="Obraz 10" descr="Sega VR - Sega Retro"/>
+            <wp:cNvGraphicFramePr>
+              <a:graphicFrameLocks xmlns:a="http://schemas.openxmlformats.org/drawingml/2006/main" noChangeAspect="1"/>
+            </wp:cNvGraphicFramePr>
+            <a:graphic xmlns:a="http://schemas.openxmlformats.org/drawingml/2006/main">
+              <a:graphicData uri="http://schemas.openxmlformats.org/drawingml/2006/picture">
+                <pic:pic xmlns:pic="http://schemas.openxmlformats.org/drawingml/2006/picture">
+                  <pic:nvPicPr>
+                    <pic:cNvPr id="0" name="Picture 19" descr="Sega VR - Sega Retro"/>
+                    <pic:cNvPicPr>
+                      <a:picLocks noChangeAspect="1" noChangeArrowheads="1"/>
+                    </pic:cNvPicPr>
+                  </pic:nvPicPr>
+                  <pic:blipFill>
+                    <a:blip r:embed="rId20">
+                      <a:extLst>
+                        <a:ext uri="{28A0092B-C50C-407E-A947-70E740481C1C}">
+                          <a14:useLocalDpi xmlns:a14="http://schemas.microsoft.com/office/drawing/2010/main" val="0"/>
+                        </a:ext>
+                      </a:extLst>
+                    </a:blip>
+                    <a:srcRect/>
+                    <a:stretch>
+                      <a:fillRect/>
+                    </a:stretch>
+                  </pic:blipFill>
+                  <pic:spPr bwMode="auto">
+                    <a:xfrm>
+                      <a:off x="0" y="0"/>
+                      <a:ext cx="4130918" cy="3299281"/>
+                    </a:xfrm>
+                    <a:prstGeom prst="rect">
+                      <a:avLst/>
+                    </a:prstGeom>
+                    <a:noFill/>
+                    <a:ln>
+                      <a:noFill/>
+                    </a:ln>
+                  </pic:spPr>
+                </pic:pic>
+              </a:graphicData>
+            </a:graphic>
+          </wp:inline>
+        </w:drawing>
+      </w:r>
+    </w:p>
+    <w:p>
+      <w:pPr>
+        <w:pStyle w:val="Praca"/>
+        <w:jc w:val="center"/>
+      </w:pPr>
+      <w:r>
+        <w:t>Rys. 1.10 Gogle firmy Sega</w:t>
+      </w:r>
+    </w:p>
+    <w:p>
+      <w:pPr>
+        <w:pStyle w:val="Praca"/>
+        <w:jc w:val="center"/>
+      </w:pPr>
+    </w:p>
+    <w:p>
+      <w:pPr>
+        <w:pStyle w:val="Praca"/>
+        <w:jc w:val="center"/>
+      </w:pPr>
+    </w:p>
+    <w:p>
+      <w:pPr>
+        <w:pStyle w:val="Praca"/>
+        <w:jc w:val="center"/>
+      </w:pPr>
+    </w:p>
+    <w:p>
+      <w:pPr>
+        <w:pStyle w:val="Praca"/>
+        <w:jc w:val="center"/>
+      </w:pPr>
+      <w:r>
+        <w:rPr>
+          <w:noProof/>
+        </w:rPr>
+        <w:lastRenderedPageBreak/>
+        <w:drawing>
+          <wp:inline distT="0" distB="0" distL="0" distR="0" wp14:anchorId="31F9CF9C" wp14:editId="3C8E714E">
+            <wp:extent cx="2377440" cy="3025140"/>
+            <wp:effectExtent l="0" t="0" r="3810" b="3810"/>
+            <wp:docPr id="2023964556" name="Obraz 12" descr="Virtual Boy – Wikipedia, wolna encyklopedia"/>
+            <wp:cNvGraphicFramePr>
+              <a:graphicFrameLocks xmlns:a="http://schemas.openxmlformats.org/drawingml/2006/main" noChangeAspect="1"/>
+            </wp:cNvGraphicFramePr>
+            <a:graphic xmlns:a="http://schemas.openxmlformats.org/drawingml/2006/main">
+              <a:graphicData uri="http://schemas.openxmlformats.org/drawingml/2006/picture">
+                <pic:pic xmlns:pic="http://schemas.openxmlformats.org/drawingml/2006/picture">
+                  <pic:nvPicPr>
+                    <pic:cNvPr id="0" name="Picture 26" descr="Virtual Boy – Wikipedia, wolna encyklopedia"/>
+                    <pic:cNvPicPr>
+                      <a:picLocks noChangeAspect="1" noChangeArrowheads="1"/>
+                    </pic:cNvPicPr>
+                  </pic:nvPicPr>
+                  <pic:blipFill>
+                    <a:blip r:embed="rId21">
+                      <a:extLst>
+                        <a:ext uri="{28A0092B-C50C-407E-A947-70E740481C1C}">
+                          <a14:useLocalDpi xmlns:a14="http://schemas.microsoft.com/office/drawing/2010/main" val="0"/>
+                        </a:ext>
+                      </a:extLst>
+                    </a:blip>
+                    <a:srcRect/>
+                    <a:stretch>
+                      <a:fillRect/>
+                    </a:stretch>
+                  </pic:blipFill>
+                  <pic:spPr bwMode="auto">
+                    <a:xfrm>
+                      <a:off x="0" y="0"/>
+                      <a:ext cx="2377440" cy="3025140"/>
+                    </a:xfrm>
+                    <a:prstGeom prst="rect">
+                      <a:avLst/>
+                    </a:prstGeom>
+                    <a:noFill/>
+                    <a:ln>
+                      <a:noFill/>
+                    </a:ln>
+                  </pic:spPr>
+                </pic:pic>
+              </a:graphicData>
+            </a:graphic>
+          </wp:inline>
+        </w:drawing>
+      </w:r>
+    </w:p>
+    <w:p>
+      <w:pPr>
+        <w:pStyle w:val="Praca"/>
+        <w:jc w:val="center"/>
+      </w:pPr>
+      <w:r>
+        <w:t>Rys. 1.11 Nintendo Virtual Boy</w:t>
+      </w:r>
+    </w:p>
+    <w:p>
+      <w:pPr>
+        <w:pStyle w:val="Praca"/>
+      </w:pPr>
+      <w:r>
+        <w:t>W podobnym okresie na komputery osobiste wyszły gogle VFX1, które oferowały doświadczenie zbliżone do tego co dziś się oczekuje od takich urządzeń. Miały one bardzo wysoką cenę oraz bardzo duże wymagania jak na tamte czasy, ale oferowały faktyczną interakcję użytkownika z grami. Mały kontroler, który potrafił rejestrować obrót na dwóch osiach oraz gogle, które choć miały niską rozdzielczość ekranu to można było na nich zagrać w popularne w tamtym okresie produkcje.</w:t>
+      </w:r>
+    </w:p>
+    <w:p>
+      <w:pPr>
+        <w:pStyle w:val="Praca"/>
+        <w:jc w:val="center"/>
+      </w:pPr>
+      <w:r>
+        <w:rPr>
+          <w:noProof/>
+        </w:rPr>
+        <w:drawing>
+          <wp:inline distT="0" distB="0" distL="0" distR="0" wp14:anchorId="28DF9DB2" wp14:editId="0000CD02">
+            <wp:extent cx="4808763" cy="2705100"/>
+            <wp:effectExtent l="0" t="0" r="0" b="0"/>
+            <wp:docPr id="1325132476" name="Obraz 13"/>
+            <wp:cNvGraphicFramePr>
+              <a:graphicFrameLocks xmlns:a="http://schemas.openxmlformats.org/drawingml/2006/main" noChangeAspect="1"/>
+            </wp:cNvGraphicFramePr>
+            <a:graphic xmlns:a="http://schemas.openxmlformats.org/drawingml/2006/main">
+              <a:graphicData uri="http://schemas.openxmlformats.org/drawingml/2006/picture">
+                <pic:pic xmlns:pic="http://schemas.openxmlformats.org/drawingml/2006/picture">
+                  <pic:nvPicPr>
+                    <pic:cNvPr id="0" name="Picture 28"/>
+                    <pic:cNvPicPr>
+                      <a:picLocks noChangeAspect="1" noChangeArrowheads="1"/>
+                    </pic:cNvPicPr>
+                  </pic:nvPicPr>
+                  <pic:blipFill>
+                    <a:blip r:embed="rId22" cstate="print">
+                      <a:extLst>
+                        <a:ext uri="{28A0092B-C50C-407E-A947-70E740481C1C}">
+                          <a14:useLocalDpi xmlns:a14="http://schemas.microsoft.com/office/drawing/2010/main" val="0"/>
+                        </a:ext>
+                      </a:extLst>
+                    </a:blip>
+                    <a:srcRect/>
+                    <a:stretch>
+                      <a:fillRect/>
+                    </a:stretch>
+                  </pic:blipFill>
+                  <pic:spPr bwMode="auto">
+                    <a:xfrm>
+                      <a:off x="0" y="0"/>
+                      <a:ext cx="4816233" cy="2709302"/>
+                    </a:xfrm>
+                    <a:prstGeom prst="rect">
+                      <a:avLst/>
+                    </a:prstGeom>
+                    <a:noFill/>
+                    <a:ln>
+                      <a:noFill/>
+                    </a:ln>
+                  </pic:spPr>
+                </pic:pic>
+              </a:graphicData>
+            </a:graphic>
+          </wp:inline>
+        </w:drawing>
+      </w:r>
+    </w:p>
+    <w:p>
+      <w:pPr>
+        <w:pStyle w:val="Praca"/>
+        <w:jc w:val="center"/>
+      </w:pPr>
+      <w:r>
+        <w:t>Rys. 1.12 Gogle VFX1</w:t>
+      </w:r>
+    </w:p>
+    <w:p>
+      <w:pPr>
+        <w:pStyle w:val="Praca"/>
+        <w:jc w:val="center"/>
+      </w:pPr>
+    </w:p>
+    <w:p>
+      <w:pPr>
+        <w:pStyle w:val="Praca"/>
+        <w:jc w:val="center"/>
+      </w:pPr>
+    </w:p>
+    <w:p>
+      <w:pPr>
+        <w:pStyle w:val="Praca"/>
+      </w:pPr>
+      <w:r>
+        <w:lastRenderedPageBreak/>
+        <w:t>Po tym wszystkim na kilka lat zapanowała cisza, którą przerwała prezentacja gogli oculus rift w 2012 roku. Od tego momentu zaczęła się współczesna era VR. Temat wirtualnej rzeczywistości zaczął się coraz częściej pojawiać na ustach ludzi. Firma oculus wciągu kilku lat wypuściło dwa zestawy developerskie dla twórców oraz pasjonatów. Na tym etapie gogle vr służyły głównie do oglądanie specjalnie przygotowanych animacji, czy filmów, gdyż nie było możliwości jeszcze nie interakcje ze środowiskiem.</w:t>
+      </w:r>
+    </w:p>
+    <w:p>
+      <w:pPr>
+        <w:pStyle w:val="Praca"/>
+        <w:jc w:val="center"/>
+      </w:pPr>
+      <w:r>
+        <w:rPr>
+          <w:noProof/>
+        </w:rPr>
+        <w:drawing>
+          <wp:inline distT="0" distB="0" distL="0" distR="0" wp14:anchorId="4D7633AA" wp14:editId="779896AF">
+            <wp:extent cx="5579745" cy="3728085"/>
+            <wp:effectExtent l="0" t="0" r="1905" b="5715"/>
+            <wp:docPr id="1899233444" name="Obraz 14" descr="undefined"/>
+            <wp:cNvGraphicFramePr>
+              <a:graphicFrameLocks xmlns:a="http://schemas.openxmlformats.org/drawingml/2006/main" noChangeAspect="1"/>
+            </wp:cNvGraphicFramePr>
+            <a:graphic xmlns:a="http://schemas.openxmlformats.org/drawingml/2006/main">
+              <a:graphicData uri="http://schemas.openxmlformats.org/drawingml/2006/picture">
+                <pic:pic xmlns:pic="http://schemas.openxmlformats.org/drawingml/2006/picture">
+                  <pic:nvPicPr>
+                    <pic:cNvPr id="0" name="Picture 30" descr="undefined"/>
+                    <pic:cNvPicPr>
+                      <a:picLocks noChangeAspect="1" noChangeArrowheads="1"/>
+                    </pic:cNvPicPr>
+                  </pic:nvPicPr>
+                  <pic:blipFill>
+                    <a:blip r:embed="rId23">
+                      <a:extLst>
+                        <a:ext uri="{28A0092B-C50C-407E-A947-70E740481C1C}">
+                          <a14:useLocalDpi xmlns:a14="http://schemas.microsoft.com/office/drawing/2010/main" val="0"/>
+                        </a:ext>
+                      </a:extLst>
+                    </a:blip>
+                    <a:srcRect/>
+                    <a:stretch>
+                      <a:fillRect/>
+                    </a:stretch>
+                  </pic:blipFill>
+                  <pic:spPr bwMode="auto">
+                    <a:xfrm>
+                      <a:off x="0" y="0"/>
+                      <a:ext cx="5579745" cy="3728085"/>
+                    </a:xfrm>
+                    <a:prstGeom prst="rect">
+                      <a:avLst/>
+                    </a:prstGeom>
+                    <a:noFill/>
+                    <a:ln>
+                      <a:noFill/>
+                    </a:ln>
+                  </pic:spPr>
+                </pic:pic>
+              </a:graphicData>
+            </a:graphic>
+          </wp:inline>
+        </w:drawing>
+      </w:r>
+    </w:p>
+    <w:p>
+      <w:pPr>
+        <w:pStyle w:val="Praca"/>
+        <w:jc w:val="center"/>
+      </w:pPr>
+      <w:r>
+        <w:t>Rys. 1.13 Oculus RIft Developer Kit 1</w:t>
+      </w:r>
+    </w:p>
+    <w:p>
+      <w:pPr>
+        <w:pStyle w:val="Praca"/>
+      </w:pPr>
+      <w:r>
+        <w:t>Wciąż największym problemem była dostępność, ale w 2014 roku Google postanowiło to zmienić. Firma uruchomiła Google Cardboard, które w założeniu pozwala każdemu posiadaczowi telefonu z androidem stworzyć własne gogle VR. Wystarczył karton, magnes, soczewki oraz telefon. Można było też kupić specjalną nakładkę na telefon, którą się zakłada na głowę i doświadcza wirtualnej rzeczywistości. Bardzo małym kosztem można było zobaczyć na czym ta wirtualna rzeczywistość polega.</w:t>
+      </w:r>
+    </w:p>
+    <w:p>
+      <w:pPr>
+        <w:pStyle w:val="Praca"/>
+      </w:pPr>
+    </w:p>
+    <w:p>
+      <w:pPr>
+        <w:pStyle w:val="Praca"/>
+      </w:pPr>
+    </w:p>
+    <w:p>
+      <w:pPr>
+        <w:pStyle w:val="Praca"/>
+      </w:pPr>
+    </w:p>
+    <w:p>
+      <w:pPr>
+        <w:pStyle w:val="Praca"/>
+      </w:pPr>
+    </w:p>
+    <w:p>
+      <w:pPr>
+        <w:pStyle w:val="Praca"/>
+        <w:jc w:val="center"/>
+      </w:pPr>
+      <w:r>
+        <w:rPr>
+          <w:noProof/>
+        </w:rPr>
+        <w:lastRenderedPageBreak/>
+        <w:drawing>
+          <wp:inline distT="0" distB="0" distL="0" distR="0" wp14:anchorId="6BDEB580" wp14:editId="12CAD459">
+            <wp:extent cx="4333222" cy="3810000"/>
+            <wp:effectExtent l="0" t="0" r="0" b="0"/>
+            <wp:docPr id="1359429772" name="Obraz 15" descr="Google Cardboard - Wikipedia"/>
+            <wp:cNvGraphicFramePr>
+              <a:graphicFrameLocks xmlns:a="http://schemas.openxmlformats.org/drawingml/2006/main" noChangeAspect="1"/>
+            </wp:cNvGraphicFramePr>
+            <a:graphic xmlns:a="http://schemas.openxmlformats.org/drawingml/2006/main">
+              <a:graphicData uri="http://schemas.openxmlformats.org/drawingml/2006/picture">
+                <pic:pic xmlns:pic="http://schemas.openxmlformats.org/drawingml/2006/picture">
+                  <pic:nvPicPr>
+                    <pic:cNvPr id="0" name="Picture 32" descr="Google Cardboard - Wikipedia"/>
+                    <pic:cNvPicPr>
+                      <a:picLocks noChangeAspect="1" noChangeArrowheads="1"/>
+                    </pic:cNvPicPr>
+                  </pic:nvPicPr>
+                  <pic:blipFill>
+                    <a:blip r:embed="rId24" cstate="print">
+                      <a:extLst>
+                        <a:ext uri="{28A0092B-C50C-407E-A947-70E740481C1C}">
+                          <a14:useLocalDpi xmlns:a14="http://schemas.microsoft.com/office/drawing/2010/main" val="0"/>
+                        </a:ext>
+                      </a:extLst>
+                    </a:blip>
+                    <a:srcRect/>
+                    <a:stretch>
+                      <a:fillRect/>
+                    </a:stretch>
+                  </pic:blipFill>
+                  <pic:spPr bwMode="auto">
+                    <a:xfrm>
+                      <a:off x="0" y="0"/>
+                      <a:ext cx="4339800" cy="3815784"/>
+                    </a:xfrm>
+                    <a:prstGeom prst="rect">
+                      <a:avLst/>
+                    </a:prstGeom>
+                    <a:noFill/>
+                    <a:ln>
+                      <a:noFill/>
+                    </a:ln>
+                  </pic:spPr>
+                </pic:pic>
+              </a:graphicData>
+            </a:graphic>
+          </wp:inline>
+        </w:drawing>
+      </w:r>
+    </w:p>
+    <w:p>
+      <w:pPr>
+        <w:pStyle w:val="Praca"/>
+        <w:jc w:val="center"/>
+      </w:pPr>
+      <w:r>
+        <w:t>Rys. 1.14 Google Cardboard</w:t>
+      </w:r>
+    </w:p>
+    <w:p>
+      <w:pPr>
+        <w:pStyle w:val="Nagwek2"/>
+      </w:pPr>
+      <w:r>
+        <w:t>1.3 Zastosowanie</w:t>
+      </w:r>
+      <w:bookmarkEnd w:id="3"/>
+    </w:p>
+    <w:p>
+      <w:pPr>
+        <w:pStyle w:val="Praca"/>
+        <w:ind w:firstLine="708"/>
+      </w:pPr>
+      <w:r>
+        <w:t>Jak może wyglądać zastosowanie o wizualizacji projektów</w:t>
+      </w:r>
+    </w:p>
+    <w:p>
+      <w:pPr>
+        <w:pStyle w:val="Nagwek2"/>
+      </w:pPr>
+      <w:bookmarkStart w:id="4" w:name="_Toc213483046"/>
+      <w:r>
+        <w:t>2. Cel Pracy</w:t>
+      </w:r>
+      <w:bookmarkEnd w:id="4"/>
+    </w:p>
+    <w:p>
+      <w:pPr>
+        <w:pStyle w:val="Nagwek2"/>
+      </w:pPr>
+      <w:bookmarkStart w:id="5" w:name="_Toc213483047"/>
+      <w:r>
+        <w:t>2.1 Dziedzina Pracy</w:t>
+      </w:r>
+      <w:bookmarkEnd w:id="5"/>
+    </w:p>
+    <w:p>
+      <w:pPr>
+        <w:pStyle w:val="Nagwek2"/>
+      </w:pPr>
+      <w:bookmarkStart w:id="6" w:name="_Toc213483048"/>
+      <w:r>
+        <w:t>2.2 Część Teoretyczna</w:t>
+      </w:r>
+      <w:bookmarkEnd w:id="6"/>
+    </w:p>
+    <w:p>
+      <w:pPr>
+        <w:pStyle w:val="Praca"/>
+        <w:ind w:firstLine="708"/>
+      </w:pPr>
+      <w:r>
+        <w:t>Omówić UE5 oraz no code</w:t>
+      </w:r>
+    </w:p>
+    <w:p>
+      <w:pPr>
+        <w:pStyle w:val="Praca"/>
+        <w:ind w:firstLine="708"/>
+      </w:pPr>
+      <w:r>
+        <w:t>Założenia i funkcjonalność aplikacji</w:t>
+      </w:r>
+    </w:p>
+    <w:p>
+      <w:pPr>
+        <w:pStyle w:val="Nagwek2"/>
+      </w:pPr>
+      <w:bookmarkStart w:id="7" w:name="_Toc213483049"/>
+      <w:r>
+        <w:t>2.3  Część Praktyczna</w:t>
+      </w:r>
+      <w:bookmarkEnd w:id="7"/>
+    </w:p>
+    <w:p>
+      <w:pPr>
         <w:pStyle w:val="Praca"/>
       </w:pPr>
     </w:p>
     <w:sectPr>
-      <w:footerReference w:type="default" r:id="rId9"/>
+      <w:footerReference w:type="even" r:id="rId25"/>
+      <w:footerReference w:type="default" r:id="rId26"/>
       <w:pgSz w:w="11906" w:h="16838"/>
       <w:pgMar w:top="1134" w:right="1134" w:bottom="1134" w:left="1985" w:header="709" w:footer="709" w:gutter="0"/>
       <w:pgNumType w:start="3"/>
@@ -586,9 +3441,35 @@
 
 <file path=word/footer1.xml><?xml version="1.0" encoding="utf-8"?>
 <w:ftr xmlns:wpc="http://schemas.microsoft.com/office/word/2010/wordprocessingCanvas" xmlns:cx="http://schemas.microsoft.com/office/drawing/2014/chartex" xmlns:cx1="http://schemas.microsoft.com/office/drawing/2015/9/8/chartex" xmlns:cx2="http://schemas.microsoft.com/office/drawing/2015/10/21/chartex" xmlns:cx3="http://schemas.microsoft.com/office/drawing/2016/5/9/chartex" xmlns:cx4="http://schemas.microsoft.com/office/drawing/2016/5/10/chartex" xmlns:cx5="http://schemas.microsoft.com/office/drawing/2016/5/11/chartex" xmlns:cx6="http://schemas.microsoft.com/office/drawing/2016/5/12/chartex" xmlns:cx7="http://schemas.microsoft.com/office/drawing/2016/5/13/chartex" xmlns:cx8="http://schemas.microsoft.com/office/drawing/2016/5/14/chartex" xmlns:mc="http://schemas.openxmlformats.org/markup-compatibility/2006" xmlns:aink="http://schemas.microsoft.com/office/drawing/2016/ink" xmlns:am3d="http://schemas.microsoft.com/office/drawing/2017/model3d" xmlns:o="urn:schemas-microsoft-com:office:office" xmlns:oel="http://schemas.microsoft.com/office/2019/extlst" xmlns:r="http://schemas.openxmlformats.org/officeDocument/2006/relationships" xmlns:m="http://schemas.openxmlformats.org/officeDocument/2006/math" xmlns:v="urn:schemas-microsoft-com:vml" xmlns:wp14="http://schemas.microsoft.com/office/word/2010/wordprocessingDrawing" xmlns:wp="http://schemas.openxmlformats.org/drawingml/2006/wordprocessingDrawing" xmlns:w10="urn:schemas-microsoft-com:office:word" xmlns:w="http://schemas.openxmlformats.org/wordprocessingml/2006/main" xmlns:w14="http://schemas.microsoft.com/office/word/2010/wordml" xmlns:w15="http://schemas.microsoft.com/office/word/2012/wordml" xmlns:w16cex="http://schemas.microsoft.com/office/word/2018/wordml/cex" xmlns:w16cid="http://schemas.microsoft.com/office/word/2016/wordml/cid" xmlns:w16="http://schemas.microsoft.com/office/word/2018/wordml" xmlns:w16du="http://schemas.microsoft.com/office/word/2023/wordml/word16du" xmlns:w16sdtdh="http://schemas.microsoft.com/office/word/2020/wordml/sdtdatahash" xmlns:w16sdtfl="http://schemas.microsoft.com/office/word/2024/wordml/sdtformatlock" xmlns:w16se="http://schemas.microsoft.com/office/word/2015/wordml/symex" xmlns:wpg="http://schemas.microsoft.com/office/word/2010/wordprocessingGroup" xmlns:wpi="http://schemas.microsoft.com/office/word/2010/wordprocessingInk" xmlns:wne="http://schemas.microsoft.com/office/word/2006/wordml" xmlns:wps="http://schemas.microsoft.com/office/word/2010/wordprocessingShape" mc:Ignorable="w14 w15 w16se w16cid w16 w16cex w16sdtdh w16sdtfl w16du wp14">
+  <w:p>
+    <w:pPr>
+      <w:pStyle w:val="Stopka"/>
+    </w:pPr>
+  </w:p>
+  <w:p>
+    <w:pPr>
+      <w:pStyle w:val="Stopka"/>
+    </w:pPr>
+  </w:p>
+</w:ftr>
+</file>
+
+<file path=word/footer2.xml><?xml version="1.0" encoding="utf-8"?>
+<w:ftr xmlns:wpc="http://schemas.microsoft.com/office/word/2010/wordprocessingCanvas" xmlns:cx="http://schemas.microsoft.com/office/drawing/2014/chartex" xmlns:cx1="http://schemas.microsoft.com/office/drawing/2015/9/8/chartex" xmlns:cx2="http://schemas.microsoft.com/office/drawing/2015/10/21/chartex" xmlns:cx3="http://schemas.microsoft.com/office/drawing/2016/5/9/chartex" xmlns:cx4="http://schemas.microsoft.com/office/drawing/2016/5/10/chartex" xmlns:cx5="http://schemas.microsoft.com/office/drawing/2016/5/11/chartex" xmlns:cx6="http://schemas.microsoft.com/office/drawing/2016/5/12/chartex" xmlns:cx7="http://schemas.microsoft.com/office/drawing/2016/5/13/chartex" xmlns:cx8="http://schemas.microsoft.com/office/drawing/2016/5/14/chartex" xmlns:mc="http://schemas.openxmlformats.org/markup-compatibility/2006" xmlns:aink="http://schemas.microsoft.com/office/drawing/2016/ink" xmlns:am3d="http://schemas.microsoft.com/office/drawing/2017/model3d" xmlns:o="urn:schemas-microsoft-com:office:office" xmlns:oel="http://schemas.microsoft.com/office/2019/extlst" xmlns:r="http://schemas.openxmlformats.org/officeDocument/2006/relationships" xmlns:m="http://schemas.openxmlformats.org/officeDocument/2006/math" xmlns:v="urn:schemas-microsoft-com:vml" xmlns:wp14="http://schemas.microsoft.com/office/word/2010/wordprocessingDrawing" xmlns:wp="http://schemas.openxmlformats.org/drawingml/2006/wordprocessingDrawing" xmlns:w10="urn:schemas-microsoft-com:office:word" xmlns:w="http://schemas.openxmlformats.org/wordprocessingml/2006/main" xmlns:w14="http://schemas.microsoft.com/office/word/2010/wordml" xmlns:w15="http://schemas.microsoft.com/office/word/2012/wordml" xmlns:w16cex="http://schemas.microsoft.com/office/word/2018/wordml/cex" xmlns:w16cid="http://schemas.microsoft.com/office/word/2016/wordml/cid" xmlns:w16="http://schemas.microsoft.com/office/word/2018/wordml" xmlns:w16du="http://schemas.microsoft.com/office/word/2023/wordml/word16du" xmlns:w16sdtdh="http://schemas.microsoft.com/office/word/2020/wordml/sdtdatahash" xmlns:w16sdtfl="http://schemas.microsoft.com/office/word/2024/wordml/sdtformatlock" xmlns:w16se="http://schemas.microsoft.com/office/word/2015/wordml/symex" xmlns:wpg="http://schemas.microsoft.com/office/word/2010/wordprocessingGroup" xmlns:wpi="http://schemas.microsoft.com/office/word/2010/wordprocessingInk" xmlns:wne="http://schemas.microsoft.com/office/word/2006/wordml" xmlns:wps="http://schemas.microsoft.com/office/word/2010/wordprocessingShape" mc:Ignorable="w14 w15 w16se w16cid w16 w16cex w16sdtdh w16sdtfl w16du wp14">
+  <w:p>
+    <w:pPr>
+      <w:pStyle w:val="Stopka"/>
+      <w:ind w:right="360"/>
+    </w:pPr>
+  </w:p>
+</w:ftr>
+</file>
+
+<file path=word/footer3.xml><?xml version="1.0" encoding="utf-8"?>
+<w:ftr xmlns:wpc="http://schemas.microsoft.com/office/word/2010/wordprocessingCanvas" xmlns:cx="http://schemas.microsoft.com/office/drawing/2014/chartex" xmlns:cx1="http://schemas.microsoft.com/office/drawing/2015/9/8/chartex" xmlns:cx2="http://schemas.microsoft.com/office/drawing/2015/10/21/chartex" xmlns:cx3="http://schemas.microsoft.com/office/drawing/2016/5/9/chartex" xmlns:cx4="http://schemas.microsoft.com/office/drawing/2016/5/10/chartex" xmlns:cx5="http://schemas.microsoft.com/office/drawing/2016/5/11/chartex" xmlns:cx6="http://schemas.microsoft.com/office/drawing/2016/5/12/chartex" xmlns:cx7="http://schemas.microsoft.com/office/drawing/2016/5/13/chartex" xmlns:cx8="http://schemas.microsoft.com/office/drawing/2016/5/14/chartex" xmlns:mc="http://schemas.openxmlformats.org/markup-compatibility/2006" xmlns:aink="http://schemas.microsoft.com/office/drawing/2016/ink" xmlns:am3d="http://schemas.microsoft.com/office/drawing/2017/model3d" xmlns:o="urn:schemas-microsoft-com:office:office" xmlns:oel="http://schemas.microsoft.com/office/2019/extlst" xmlns:r="http://schemas.openxmlformats.org/officeDocument/2006/relationships" xmlns:m="http://schemas.openxmlformats.org/officeDocument/2006/math" xmlns:v="urn:schemas-microsoft-com:vml" xmlns:wp14="http://schemas.microsoft.com/office/word/2010/wordprocessingDrawing" xmlns:wp="http://schemas.openxmlformats.org/drawingml/2006/wordprocessingDrawing" xmlns:w10="urn:schemas-microsoft-com:office:word" xmlns:w="http://schemas.openxmlformats.org/wordprocessingml/2006/main" xmlns:w14="http://schemas.microsoft.com/office/word/2010/wordml" xmlns:w15="http://schemas.microsoft.com/office/word/2012/wordml" xmlns:w16cex="http://schemas.microsoft.com/office/word/2018/wordml/cex" xmlns:w16cid="http://schemas.microsoft.com/office/word/2016/wordml/cid" xmlns:w16="http://schemas.microsoft.com/office/word/2018/wordml" xmlns:w16du="http://schemas.microsoft.com/office/word/2023/wordml/word16du" xmlns:w16sdtdh="http://schemas.microsoft.com/office/word/2020/wordml/sdtdatahash" xmlns:w16sdtfl="http://schemas.microsoft.com/office/word/2024/wordml/sdtformatlock" xmlns:w16se="http://schemas.microsoft.com/office/word/2015/wordml/symex" xmlns:wpg="http://schemas.microsoft.com/office/word/2010/wordprocessingGroup" xmlns:wpi="http://schemas.microsoft.com/office/word/2010/wordprocessingInk" xmlns:wne="http://schemas.microsoft.com/office/word/2006/wordml" xmlns:wps="http://schemas.microsoft.com/office/word/2010/wordprocessingShape" mc:Ignorable="w14 w15 w16se w16cid w16 w16cex w16sdtdh w16sdtfl w16du wp14">
   <w:sdt>
     <w:sdtPr>
-      <w:id w:val="-1201866857"/>
+      <w:id w:val="1190252334"/>
       <w:docPartObj>
         <w:docPartGallery w:val="Page Numbers (Bottom of Page)"/>
         <w:docPartUnique/>
@@ -625,18 +3506,7 @@
 </w:ftr>
 </file>
 
-<file path=word/footer2.xml><?xml version="1.0" encoding="utf-8"?>
-<w:ftr xmlns:wpc="http://schemas.microsoft.com/office/word/2010/wordprocessingCanvas" xmlns:cx="http://schemas.microsoft.com/office/drawing/2014/chartex" xmlns:cx1="http://schemas.microsoft.com/office/drawing/2015/9/8/chartex" xmlns:cx2="http://schemas.microsoft.com/office/drawing/2015/10/21/chartex" xmlns:cx3="http://schemas.microsoft.com/office/drawing/2016/5/9/chartex" xmlns:cx4="http://schemas.microsoft.com/office/drawing/2016/5/10/chartex" xmlns:cx5="http://schemas.microsoft.com/office/drawing/2016/5/11/chartex" xmlns:cx6="http://schemas.microsoft.com/office/drawing/2016/5/12/chartex" xmlns:cx7="http://schemas.microsoft.com/office/drawing/2016/5/13/chartex" xmlns:cx8="http://schemas.microsoft.com/office/drawing/2016/5/14/chartex" xmlns:mc="http://schemas.openxmlformats.org/markup-compatibility/2006" xmlns:aink="http://schemas.microsoft.com/office/drawing/2016/ink" xmlns:am3d="http://schemas.microsoft.com/office/drawing/2017/model3d" xmlns:o="urn:schemas-microsoft-com:office:office" xmlns:oel="http://schemas.microsoft.com/office/2019/extlst" xmlns:r="http://schemas.openxmlformats.org/officeDocument/2006/relationships" xmlns:m="http://schemas.openxmlformats.org/officeDocument/2006/math" xmlns:v="urn:schemas-microsoft-com:vml" xmlns:wp14="http://schemas.microsoft.com/office/word/2010/wordprocessingDrawing" xmlns:wp="http://schemas.openxmlformats.org/drawingml/2006/wordprocessingDrawing" xmlns:w10="urn:schemas-microsoft-com:office:word" xmlns:w="http://schemas.openxmlformats.org/wordprocessingml/2006/main" xmlns:w14="http://schemas.microsoft.com/office/word/2010/wordml" xmlns:w15="http://schemas.microsoft.com/office/word/2012/wordml" xmlns:w16cex="http://schemas.microsoft.com/office/word/2018/wordml/cex" xmlns:w16cid="http://schemas.microsoft.com/office/word/2016/wordml/cid" xmlns:w16="http://schemas.microsoft.com/office/word/2018/wordml" xmlns:w16du="http://schemas.microsoft.com/office/word/2023/wordml/word16du" xmlns:w16sdtdh="http://schemas.microsoft.com/office/word/2020/wordml/sdtdatahash" xmlns:w16sdtfl="http://schemas.microsoft.com/office/word/2024/wordml/sdtformatlock" xmlns:w16se="http://schemas.microsoft.com/office/word/2015/wordml/symex" xmlns:wpg="http://schemas.microsoft.com/office/word/2010/wordprocessingGroup" xmlns:wpi="http://schemas.microsoft.com/office/word/2010/wordprocessingInk" xmlns:wne="http://schemas.microsoft.com/office/word/2006/wordml" xmlns:wps="http://schemas.microsoft.com/office/word/2010/wordprocessingShape" mc:Ignorable="w14 w15 w16se w16cid w16 w16cex w16sdtdh w16sdtfl w16du wp14">
-  <w:p>
-    <w:pPr>
-      <w:pStyle w:val="Stopka"/>
-      <w:ind w:right="360"/>
-    </w:pPr>
-  </w:p>
-</w:ftr>
-</file>
-
-<file path=word/footer3.xml><?xml version="1.0" encoding="utf-8"?>
+<file path=word/footer4.xml><?xml version="1.0" encoding="utf-8"?>
 <w:ftr xmlns:wpc="http://schemas.microsoft.com/office/word/2010/wordprocessingCanvas" xmlns:cx="http://schemas.microsoft.com/office/drawing/2014/chartex" xmlns:cx1="http://schemas.microsoft.com/office/drawing/2015/9/8/chartex" xmlns:cx2="http://schemas.microsoft.com/office/drawing/2015/10/21/chartex" xmlns:cx3="http://schemas.microsoft.com/office/drawing/2016/5/9/chartex" xmlns:cx4="http://schemas.microsoft.com/office/drawing/2016/5/10/chartex" xmlns:cx5="http://schemas.microsoft.com/office/drawing/2016/5/11/chartex" xmlns:cx6="http://schemas.microsoft.com/office/drawing/2016/5/12/chartex" xmlns:cx7="http://schemas.microsoft.com/office/drawing/2016/5/13/chartex" xmlns:cx8="http://schemas.microsoft.com/office/drawing/2016/5/14/chartex" xmlns:mc="http://schemas.openxmlformats.org/markup-compatibility/2006" xmlns:aink="http://schemas.microsoft.com/office/drawing/2016/ink" xmlns:am3d="http://schemas.microsoft.com/office/drawing/2017/model3d" xmlns:o="urn:schemas-microsoft-com:office:office" xmlns:oel="http://schemas.microsoft.com/office/2019/extlst" xmlns:r="http://schemas.openxmlformats.org/officeDocument/2006/relationships" xmlns:m="http://schemas.openxmlformats.org/officeDocument/2006/math" xmlns:v="urn:schemas-microsoft-com:vml" xmlns:wp14="http://schemas.microsoft.com/office/word/2010/wordprocessingDrawing" xmlns:wp="http://schemas.openxmlformats.org/drawingml/2006/wordprocessingDrawing" xmlns:w10="urn:schemas-microsoft-com:office:word" xmlns:w="http://schemas.openxmlformats.org/wordprocessingml/2006/main" xmlns:w14="http://schemas.microsoft.com/office/word/2010/wordml" xmlns:w15="http://schemas.microsoft.com/office/word/2012/wordml" xmlns:w16cex="http://schemas.microsoft.com/office/word/2018/wordml/cex" xmlns:w16cid="http://schemas.microsoft.com/office/word/2016/wordml/cid" xmlns:w16="http://schemas.microsoft.com/office/word/2018/wordml" xmlns:w16du="http://schemas.microsoft.com/office/word/2023/wordml/word16du" xmlns:w16sdtdh="http://schemas.microsoft.com/office/word/2020/wordml/sdtdatahash" xmlns:w16sdtfl="http://schemas.microsoft.com/office/word/2024/wordml/sdtformatlock" xmlns:w16se="http://schemas.microsoft.com/office/word/2015/wordml/symex" xmlns:wpg="http://schemas.microsoft.com/office/word/2010/wordprocessingGroup" xmlns:wpi="http://schemas.microsoft.com/office/word/2010/wordprocessingInk" xmlns:wne="http://schemas.microsoft.com/office/word/2006/wordml" xmlns:wps="http://schemas.microsoft.com/office/word/2010/wordprocessingShape" mc:Ignorable="w14 w15 w16se w16cid w16 w16cex w16sdtdh w16sdtfl w16du wp14">
   <w:sdt>
     <w:sdtPr>
@@ -702,6 +3572,287 @@
     </w:p>
   </w:footnote>
 </w:footnotes>
+</file>
+
+<file path=word/numbering.xml><?xml version="1.0" encoding="utf-8"?>
+<w:numbering xmlns:wpc="http://schemas.microsoft.com/office/word/2010/wordprocessingCanvas" xmlns:cx="http://schemas.microsoft.com/office/drawing/2014/chartex" xmlns:cx1="http://schemas.microsoft.com/office/drawing/2015/9/8/chartex" xmlns:cx2="http://schemas.microsoft.com/office/drawing/2015/10/21/chartex" xmlns:cx3="http://schemas.microsoft.com/office/drawing/2016/5/9/chartex" xmlns:cx4="http://schemas.microsoft.com/office/drawing/2016/5/10/chartex" xmlns:cx5="http://schemas.microsoft.com/office/drawing/2016/5/11/chartex" xmlns:cx6="http://schemas.microsoft.com/office/drawing/2016/5/12/chartex" xmlns:cx7="http://schemas.microsoft.com/office/drawing/2016/5/13/chartex" xmlns:cx8="http://schemas.microsoft.com/office/drawing/2016/5/14/chartex" xmlns:mc="http://schemas.openxmlformats.org/markup-compatibility/2006" xmlns:aink="http://schemas.microsoft.com/office/drawing/2016/ink" xmlns:am3d="http://schemas.microsoft.com/office/drawing/2017/model3d" xmlns:o="urn:schemas-microsoft-com:office:office" xmlns:oel="http://schemas.microsoft.com/office/2019/extlst" xmlns:r="http://schemas.openxmlformats.org/officeDocument/2006/relationships" xmlns:m="http://schemas.openxmlformats.org/officeDocument/2006/math" xmlns:v="urn:schemas-microsoft-com:vml" xmlns:wp14="http://schemas.microsoft.com/office/word/2010/wordprocessingDrawing" xmlns:wp="http://schemas.openxmlformats.org/drawingml/2006/wordprocessingDrawing" xmlns:w10="urn:schemas-microsoft-com:office:word" xmlns:w="http://schemas.openxmlformats.org/wordprocessingml/2006/main" xmlns:w14="http://schemas.microsoft.com/office/word/2010/wordml" xmlns:w15="http://schemas.microsoft.com/office/word/2012/wordml" xmlns:w16cex="http://schemas.microsoft.com/office/word/2018/wordml/cex" xmlns:w16cid="http://schemas.microsoft.com/office/word/2016/wordml/cid" xmlns:w16="http://schemas.microsoft.com/office/word/2018/wordml" xmlns:w16du="http://schemas.microsoft.com/office/word/2023/wordml/word16du" xmlns:w16sdtdh="http://schemas.microsoft.com/office/word/2020/wordml/sdtdatahash" xmlns:w16sdtfl="http://schemas.microsoft.com/office/word/2024/wordml/sdtformatlock" xmlns:w16se="http://schemas.microsoft.com/office/word/2015/wordml/symex" xmlns:wpg="http://schemas.microsoft.com/office/word/2010/wordprocessingGroup" xmlns:wpi="http://schemas.microsoft.com/office/word/2010/wordprocessingInk" xmlns:wne="http://schemas.microsoft.com/office/word/2006/wordml" xmlns:wps="http://schemas.microsoft.com/office/word/2010/wordprocessingShape" mc:Ignorable="w14 w15 w16se w16cid w16 w16cex w16sdtdh w16sdtfl w16du wp14">
+  <w:abstractNum w:abstractNumId="0" w15:restartNumberingAfterBreak="0">
+    <w:nsid w:val="37475984"/>
+    <w:multiLevelType w:val="hybridMultilevel"/>
+    <w:tmpl w:val="63400CA8"/>
+    <w:lvl w:ilvl="0" w:tplc="0415000F">
+      <w:start w:val="1"/>
+      <w:numFmt w:val="decimal"/>
+      <w:lvlText w:val="%1."/>
+      <w:lvlJc w:val="left"/>
+      <w:pPr>
+        <w:ind w:left="720" w:hanging="360"/>
+      </w:pPr>
+      <w:rPr>
+        <w:rFonts w:hint="default"/>
+      </w:rPr>
+    </w:lvl>
+    <w:lvl w:ilvl="1" w:tplc="04150019" w:tentative="1">
+      <w:start w:val="1"/>
+      <w:numFmt w:val="lowerLetter"/>
+      <w:lvlText w:val="%2."/>
+      <w:lvlJc w:val="left"/>
+      <w:pPr>
+        <w:ind w:left="1440" w:hanging="360"/>
+      </w:pPr>
+    </w:lvl>
+    <w:lvl w:ilvl="2" w:tplc="0415001B" w:tentative="1">
+      <w:start w:val="1"/>
+      <w:numFmt w:val="lowerRoman"/>
+      <w:lvlText w:val="%3."/>
+      <w:lvlJc w:val="right"/>
+      <w:pPr>
+        <w:ind w:left="2160" w:hanging="180"/>
+      </w:pPr>
+    </w:lvl>
+    <w:lvl w:ilvl="3" w:tplc="0415000F" w:tentative="1">
+      <w:start w:val="1"/>
+      <w:numFmt w:val="decimal"/>
+      <w:lvlText w:val="%4."/>
+      <w:lvlJc w:val="left"/>
+      <w:pPr>
+        <w:ind w:left="2880" w:hanging="360"/>
+      </w:pPr>
+    </w:lvl>
+    <w:lvl w:ilvl="4" w:tplc="04150019" w:tentative="1">
+      <w:start w:val="1"/>
+      <w:numFmt w:val="lowerLetter"/>
+      <w:lvlText w:val="%5."/>
+      <w:lvlJc w:val="left"/>
+      <w:pPr>
+        <w:ind w:left="3600" w:hanging="360"/>
+      </w:pPr>
+    </w:lvl>
+    <w:lvl w:ilvl="5" w:tplc="0415001B" w:tentative="1">
+      <w:start w:val="1"/>
+      <w:numFmt w:val="lowerRoman"/>
+      <w:lvlText w:val="%6."/>
+      <w:lvlJc w:val="right"/>
+      <w:pPr>
+        <w:ind w:left="4320" w:hanging="180"/>
+      </w:pPr>
+    </w:lvl>
+    <w:lvl w:ilvl="6" w:tplc="0415000F" w:tentative="1">
+      <w:start w:val="1"/>
+      <w:numFmt w:val="decimal"/>
+      <w:lvlText w:val="%7."/>
+      <w:lvlJc w:val="left"/>
+      <w:pPr>
+        <w:ind w:left="5040" w:hanging="360"/>
+      </w:pPr>
+    </w:lvl>
+    <w:lvl w:ilvl="7" w:tplc="04150019" w:tentative="1">
+      <w:start w:val="1"/>
+      <w:numFmt w:val="lowerLetter"/>
+      <w:lvlText w:val="%8."/>
+      <w:lvlJc w:val="left"/>
+      <w:pPr>
+        <w:ind w:left="5760" w:hanging="360"/>
+      </w:pPr>
+    </w:lvl>
+    <w:lvl w:ilvl="8" w:tplc="0415001B" w:tentative="1">
+      <w:start w:val="1"/>
+      <w:numFmt w:val="lowerRoman"/>
+      <w:lvlText w:val="%9."/>
+      <w:lvlJc w:val="right"/>
+      <w:pPr>
+        <w:ind w:left="6480" w:hanging="180"/>
+      </w:pPr>
+    </w:lvl>
+  </w:abstractNum>
+  <w:abstractNum w:abstractNumId="1" w15:restartNumberingAfterBreak="0">
+    <w:nsid w:val="3E76685E"/>
+    <w:multiLevelType w:val="hybridMultilevel"/>
+    <w:tmpl w:val="AE30EDE2"/>
+    <w:lvl w:ilvl="0" w:tplc="0415000F">
+      <w:start w:val="1"/>
+      <w:numFmt w:val="decimal"/>
+      <w:lvlText w:val="%1."/>
+      <w:lvlJc w:val="left"/>
+      <w:pPr>
+        <w:ind w:left="720" w:hanging="360"/>
+      </w:pPr>
+      <w:rPr>
+        <w:rFonts w:hint="default"/>
+      </w:rPr>
+    </w:lvl>
+    <w:lvl w:ilvl="1" w:tplc="04150019" w:tentative="1">
+      <w:start w:val="1"/>
+      <w:numFmt w:val="lowerLetter"/>
+      <w:lvlText w:val="%2."/>
+      <w:lvlJc w:val="left"/>
+      <w:pPr>
+        <w:ind w:left="1440" w:hanging="360"/>
+      </w:pPr>
+    </w:lvl>
+    <w:lvl w:ilvl="2" w:tplc="0415001B" w:tentative="1">
+      <w:start w:val="1"/>
+      <w:numFmt w:val="lowerRoman"/>
+      <w:lvlText w:val="%3."/>
+      <w:lvlJc w:val="right"/>
+      <w:pPr>
+        <w:ind w:left="2160" w:hanging="180"/>
+      </w:pPr>
+    </w:lvl>
+    <w:lvl w:ilvl="3" w:tplc="0415000F" w:tentative="1">
+      <w:start w:val="1"/>
+      <w:numFmt w:val="decimal"/>
+      <w:lvlText w:val="%4."/>
+      <w:lvlJc w:val="left"/>
+      <w:pPr>
+        <w:ind w:left="2880" w:hanging="360"/>
+      </w:pPr>
+    </w:lvl>
+    <w:lvl w:ilvl="4" w:tplc="04150019" w:tentative="1">
+      <w:start w:val="1"/>
+      <w:numFmt w:val="lowerLetter"/>
+      <w:lvlText w:val="%5."/>
+      <w:lvlJc w:val="left"/>
+      <w:pPr>
+        <w:ind w:left="3600" w:hanging="360"/>
+      </w:pPr>
+    </w:lvl>
+    <w:lvl w:ilvl="5" w:tplc="0415001B" w:tentative="1">
+      <w:start w:val="1"/>
+      <w:numFmt w:val="lowerRoman"/>
+      <w:lvlText w:val="%6."/>
+      <w:lvlJc w:val="right"/>
+      <w:pPr>
+        <w:ind w:left="4320" w:hanging="180"/>
+      </w:pPr>
+    </w:lvl>
+    <w:lvl w:ilvl="6" w:tplc="0415000F" w:tentative="1">
+      <w:start w:val="1"/>
+      <w:numFmt w:val="decimal"/>
+      <w:lvlText w:val="%7."/>
+      <w:lvlJc w:val="left"/>
+      <w:pPr>
+        <w:ind w:left="5040" w:hanging="360"/>
+      </w:pPr>
+    </w:lvl>
+    <w:lvl w:ilvl="7" w:tplc="04150019" w:tentative="1">
+      <w:start w:val="1"/>
+      <w:numFmt w:val="lowerLetter"/>
+      <w:lvlText w:val="%8."/>
+      <w:lvlJc w:val="left"/>
+      <w:pPr>
+        <w:ind w:left="5760" w:hanging="360"/>
+      </w:pPr>
+    </w:lvl>
+    <w:lvl w:ilvl="8" w:tplc="0415001B" w:tentative="1">
+      <w:start w:val="1"/>
+      <w:numFmt w:val="lowerRoman"/>
+      <w:lvlText w:val="%9."/>
+      <w:lvlJc w:val="right"/>
+      <w:pPr>
+        <w:ind w:left="6480" w:hanging="180"/>
+      </w:pPr>
+    </w:lvl>
+  </w:abstractNum>
+  <w:abstractNum w:abstractNumId="2" w15:restartNumberingAfterBreak="0">
+    <w:nsid w:val="5D530D8D"/>
+    <w:multiLevelType w:val="multilevel"/>
+    <w:tmpl w:val="0415001F"/>
+    <w:lvl w:ilvl="0">
+      <w:start w:val="1"/>
+      <w:numFmt w:val="decimal"/>
+      <w:lvlText w:val="%1."/>
+      <w:lvlJc w:val="left"/>
+      <w:pPr>
+        <w:ind w:left="360" w:hanging="360"/>
+      </w:pPr>
+      <w:rPr>
+        <w:rFonts w:hint="default"/>
+      </w:rPr>
+    </w:lvl>
+    <w:lvl w:ilvl="1">
+      <w:start w:val="1"/>
+      <w:numFmt w:val="decimal"/>
+      <w:lvlText w:val="%1.%2."/>
+      <w:lvlJc w:val="left"/>
+      <w:pPr>
+        <w:ind w:left="792" w:hanging="432"/>
+      </w:pPr>
+    </w:lvl>
+    <w:lvl w:ilvl="2">
+      <w:start w:val="1"/>
+      <w:numFmt w:val="decimal"/>
+      <w:lvlText w:val="%1.%2.%3."/>
+      <w:lvlJc w:val="left"/>
+      <w:pPr>
+        <w:ind w:left="1224" w:hanging="504"/>
+      </w:pPr>
+    </w:lvl>
+    <w:lvl w:ilvl="3">
+      <w:start w:val="1"/>
+      <w:numFmt w:val="decimal"/>
+      <w:lvlText w:val="%1.%2.%3.%4."/>
+      <w:lvlJc w:val="left"/>
+      <w:pPr>
+        <w:ind w:left="1728" w:hanging="648"/>
+      </w:pPr>
+    </w:lvl>
+    <w:lvl w:ilvl="4">
+      <w:start w:val="1"/>
+      <w:numFmt w:val="decimal"/>
+      <w:lvlText w:val="%1.%2.%3.%4.%5."/>
+      <w:lvlJc w:val="left"/>
+      <w:pPr>
+        <w:ind w:left="2232" w:hanging="792"/>
+      </w:pPr>
+    </w:lvl>
+    <w:lvl w:ilvl="5">
+      <w:start w:val="1"/>
+      <w:numFmt w:val="decimal"/>
+      <w:lvlText w:val="%1.%2.%3.%4.%5.%6."/>
+      <w:lvlJc w:val="left"/>
+      <w:pPr>
+        <w:ind w:left="2736" w:hanging="936"/>
+      </w:pPr>
+    </w:lvl>
+    <w:lvl w:ilvl="6">
+      <w:start w:val="1"/>
+      <w:numFmt w:val="decimal"/>
+      <w:lvlText w:val="%1.%2.%3.%4.%5.%6.%7."/>
+      <w:lvlJc w:val="left"/>
+      <w:pPr>
+        <w:ind w:left="3240" w:hanging="1080"/>
+      </w:pPr>
+    </w:lvl>
+    <w:lvl w:ilvl="7">
+      <w:start w:val="1"/>
+      <w:numFmt w:val="decimal"/>
+      <w:lvlText w:val="%1.%2.%3.%4.%5.%6.%7.%8."/>
+      <w:lvlJc w:val="left"/>
+      <w:pPr>
+        <w:ind w:left="3744" w:hanging="1224"/>
+      </w:pPr>
+    </w:lvl>
+    <w:lvl w:ilvl="8">
+      <w:start w:val="1"/>
+      <w:numFmt w:val="decimal"/>
+      <w:lvlText w:val="%1.%2.%3.%4.%5.%6.%7.%8.%9."/>
+      <w:lvlJc w:val="left"/>
+      <w:pPr>
+        <w:ind w:left="4320" w:hanging="1440"/>
+      </w:pPr>
+    </w:lvl>
+  </w:abstractNum>
+  <w:num w:numId="1" w16cid:durableId="140121814">
+    <w:abstractNumId w:val="2"/>
+  </w:num>
+  <w:num w:numId="2" w16cid:durableId="1234849669">
+    <w:abstractNumId w:val="1"/>
+  </w:num>
+  <w:num w:numId="3" w16cid:durableId="2074346983">
+    <w:abstractNumId w:val="0"/>
+  </w:num>
+</w:numbering>
 </file>
 
 <file path=word/styles.xml><?xml version="1.0" encoding="utf-8"?>
@@ -1103,6 +4254,49 @@
       <w:lang w:eastAsia="en-US"/>
     </w:rPr>
   </w:style>
+  <w:style w:type="paragraph" w:styleId="Nagwek1">
+    <w:name w:val="heading 1"/>
+    <w:basedOn w:val="Normalny"/>
+    <w:next w:val="Normalny"/>
+    <w:link w:val="Nagwek1Znak"/>
+    <w:uiPriority w:val="9"/>
+    <w:qFormat/>
+    <w:rsid w:val="00AD479A"/>
+    <w:pPr>
+      <w:keepNext/>
+      <w:keepLines/>
+      <w:spacing w:before="240" w:after="0"/>
+      <w:outlineLvl w:val="0"/>
+    </w:pPr>
+    <w:rPr>
+      <w:rFonts w:asciiTheme="majorHAnsi" w:eastAsiaTheme="majorEastAsia" w:hAnsiTheme="majorHAnsi" w:cstheme="majorBidi"/>
+      <w:color w:val="2E74B5" w:themeColor="accent1" w:themeShade="BF"/>
+      <w:sz w:val="32"/>
+      <w:szCs w:val="32"/>
+    </w:rPr>
+  </w:style>
+  <w:style w:type="paragraph" w:styleId="Nagwek2">
+    <w:name w:val="heading 2"/>
+    <w:basedOn w:val="Normalny"/>
+    <w:next w:val="Normalny"/>
+    <w:link w:val="Nagwek2Znak"/>
+    <w:uiPriority w:val="9"/>
+    <w:unhideWhenUsed/>
+    <w:qFormat/>
+    <w:rsid w:val="00C40AF6"/>
+    <w:pPr>
+      <w:keepNext/>
+      <w:keepLines/>
+      <w:spacing w:before="40" w:after="0"/>
+      <w:outlineLvl w:val="1"/>
+    </w:pPr>
+    <w:rPr>
+      <w:rFonts w:asciiTheme="majorHAnsi" w:eastAsiaTheme="majorEastAsia" w:hAnsiTheme="majorHAnsi" w:cstheme="majorBidi"/>
+      <w:color w:val="2E74B5" w:themeColor="accent1" w:themeShade="BF"/>
+      <w:sz w:val="26"/>
+      <w:szCs w:val="26"/>
+    </w:rPr>
+  </w:style>
   <w:style w:type="character" w:default="1" w:styleId="Domylnaczcionkaakapitu">
     <w:name w:val="Default Paragraph Font"/>
     <w:uiPriority w:val="1"/>
@@ -1290,6 +4484,171 @@
       <w:szCs w:val="24"/>
       <w:lang w:eastAsia="en-US"/>
     </w:rPr>
+  </w:style>
+  <w:style w:type="paragraph" w:styleId="Tekstprzypisukocowego">
+    <w:name w:val="endnote text"/>
+    <w:basedOn w:val="Normalny"/>
+    <w:link w:val="TekstprzypisukocowegoZnak"/>
+    <w:uiPriority w:val="99"/>
+    <w:semiHidden/>
+    <w:unhideWhenUsed/>
+    <w:rsid w:val="004D532A"/>
+    <w:pPr>
+      <w:spacing w:after="0" w:line="240" w:lineRule="auto"/>
+    </w:pPr>
+    <w:rPr>
+      <w:sz w:val="20"/>
+      <w:szCs w:val="20"/>
+    </w:rPr>
+  </w:style>
+  <w:style w:type="character" w:customStyle="1" w:styleId="TekstprzypisukocowegoZnak">
+    <w:name w:val="Tekst przypisu końcowego Znak"/>
+    <w:basedOn w:val="Domylnaczcionkaakapitu"/>
+    <w:link w:val="Tekstprzypisukocowego"/>
+    <w:uiPriority w:val="99"/>
+    <w:semiHidden/>
+    <w:rsid w:val="004D532A"/>
+    <w:rPr>
+      <w:rFonts w:ascii="Calibri" w:eastAsia="Calibri" w:hAnsi="Calibri" w:cs="Times New Roman"/>
+      <w:lang w:eastAsia="en-US"/>
+    </w:rPr>
+  </w:style>
+  <w:style w:type="character" w:styleId="Odwoanieprzypisukocowego">
+    <w:name w:val="endnote reference"/>
+    <w:basedOn w:val="Domylnaczcionkaakapitu"/>
+    <w:uiPriority w:val="99"/>
+    <w:semiHidden/>
+    <w:unhideWhenUsed/>
+    <w:rsid w:val="004D532A"/>
+    <w:rPr>
+      <w:vertAlign w:val="superscript"/>
+    </w:rPr>
+  </w:style>
+  <w:style w:type="character" w:customStyle="1" w:styleId="Nagwek2Znak">
+    <w:name w:val="Nagłówek 2 Znak"/>
+    <w:basedOn w:val="Domylnaczcionkaakapitu"/>
+    <w:link w:val="Nagwek2"/>
+    <w:uiPriority w:val="9"/>
+    <w:rsid w:val="00C40AF6"/>
+    <w:rPr>
+      <w:rFonts w:asciiTheme="majorHAnsi" w:eastAsiaTheme="majorEastAsia" w:hAnsiTheme="majorHAnsi" w:cstheme="majorBidi"/>
+      <w:color w:val="2E74B5" w:themeColor="accent1" w:themeShade="BF"/>
+      <w:sz w:val="26"/>
+      <w:szCs w:val="26"/>
+      <w:lang w:eastAsia="en-US"/>
+    </w:rPr>
+  </w:style>
+  <w:style w:type="character" w:customStyle="1" w:styleId="Nagwek1Znak">
+    <w:name w:val="Nagłówek 1 Znak"/>
+    <w:basedOn w:val="Domylnaczcionkaakapitu"/>
+    <w:link w:val="Nagwek1"/>
+    <w:uiPriority w:val="9"/>
+    <w:rsid w:val="00AD479A"/>
+    <w:rPr>
+      <w:rFonts w:asciiTheme="majorHAnsi" w:eastAsiaTheme="majorEastAsia" w:hAnsiTheme="majorHAnsi" w:cstheme="majorBidi"/>
+      <w:color w:val="2E74B5" w:themeColor="accent1" w:themeShade="BF"/>
+      <w:sz w:val="32"/>
+      <w:szCs w:val="32"/>
+      <w:lang w:eastAsia="en-US"/>
+    </w:rPr>
+  </w:style>
+  <w:style w:type="paragraph" w:styleId="Nagwekspisutreci">
+    <w:name w:val="TOC Heading"/>
+    <w:basedOn w:val="Nagwek1"/>
+    <w:next w:val="Normalny"/>
+    <w:uiPriority w:val="39"/>
+    <w:unhideWhenUsed/>
+    <w:qFormat/>
+    <w:rsid w:val="00AD479A"/>
+    <w:pPr>
+      <w:suppressAutoHyphens w:val="0"/>
+      <w:autoSpaceDN/>
+      <w:spacing w:line="259" w:lineRule="auto"/>
+      <w:textAlignment w:val="auto"/>
+      <w:outlineLvl w:val="9"/>
+    </w:pPr>
+    <w:rPr>
+      <w:lang w:eastAsia="pl-PL"/>
+    </w:rPr>
+  </w:style>
+  <w:style w:type="paragraph" w:styleId="Spistreci2">
+    <w:name w:val="toc 2"/>
+    <w:basedOn w:val="Normalny"/>
+    <w:next w:val="Normalny"/>
+    <w:autoRedefine/>
+    <w:uiPriority w:val="39"/>
+    <w:unhideWhenUsed/>
+    <w:rsid w:val="00AD479A"/>
+    <w:pPr>
+      <w:spacing w:after="100"/>
+      <w:ind w:left="220"/>
+    </w:pPr>
+  </w:style>
+  <w:style w:type="character" w:styleId="Hipercze">
+    <w:name w:val="Hyperlink"/>
+    <w:basedOn w:val="Domylnaczcionkaakapitu"/>
+    <w:uiPriority w:val="99"/>
+    <w:unhideWhenUsed/>
+    <w:rsid w:val="00AD479A"/>
+    <w:rPr>
+      <w:color w:val="0563C1" w:themeColor="hyperlink"/>
+      <w:u w:val="single"/>
+    </w:rPr>
+  </w:style>
+  <w:style w:type="paragraph" w:styleId="Spistreci1">
+    <w:name w:val="toc 1"/>
+    <w:basedOn w:val="Normalny"/>
+    <w:next w:val="Normalny"/>
+    <w:autoRedefine/>
+    <w:uiPriority w:val="39"/>
+    <w:unhideWhenUsed/>
+    <w:rsid w:val="00AD479A"/>
+    <w:pPr>
+      <w:suppressAutoHyphens w:val="0"/>
+      <w:autoSpaceDN/>
+      <w:spacing w:after="100" w:line="259" w:lineRule="auto"/>
+      <w:textAlignment w:val="auto"/>
+    </w:pPr>
+    <w:rPr>
+      <w:rFonts w:asciiTheme="minorHAnsi" w:eastAsiaTheme="minorEastAsia" w:hAnsiTheme="minorHAnsi"/>
+      <w:lang w:eastAsia="pl-PL"/>
+    </w:rPr>
+  </w:style>
+  <w:style w:type="paragraph" w:styleId="Spistreci3">
+    <w:name w:val="toc 3"/>
+    <w:basedOn w:val="Normalny"/>
+    <w:next w:val="Normalny"/>
+    <w:autoRedefine/>
+    <w:uiPriority w:val="39"/>
+    <w:unhideWhenUsed/>
+    <w:rsid w:val="00AD479A"/>
+    <w:pPr>
+      <w:suppressAutoHyphens w:val="0"/>
+      <w:autoSpaceDN/>
+      <w:spacing w:after="100" w:line="259" w:lineRule="auto"/>
+      <w:ind w:left="440"/>
+      <w:textAlignment w:val="auto"/>
+    </w:pPr>
+    <w:rPr>
+      <w:rFonts w:asciiTheme="minorHAnsi" w:eastAsiaTheme="minorEastAsia" w:hAnsiTheme="minorHAnsi"/>
+      <w:lang w:eastAsia="pl-PL"/>
+    </w:rPr>
+  </w:style>
+  <w:style w:type="table" w:styleId="Tabela-Siatka">
+    <w:name w:val="Table Grid"/>
+    <w:basedOn w:val="Standardowy"/>
+    <w:uiPriority w:val="39"/>
+    <w:rsid w:val="001D3DF9"/>
+    <w:tblPr>
+      <w:tblBorders>
+        <w:top w:val="single" w:sz="4" w:space="0" w:color="auto"/>
+        <w:left w:val="single" w:sz="4" w:space="0" w:color="auto"/>
+        <w:bottom w:val="single" w:sz="4" w:space="0" w:color="auto"/>
+        <w:right w:val="single" w:sz="4" w:space="0" w:color="auto"/>
+        <w:insideH w:val="single" w:sz="4" w:space="0" w:color="auto"/>
+        <w:insideV w:val="single" w:sz="4" w:space="0" w:color="auto"/>
+      </w:tblBorders>
+    </w:tblPr>
   </w:style>
 </w:styles>
 </file>
@@ -1548,4 +4907,16 @@
   <a:objectDefaults/>
   <a:extraClrSchemeLst/>
 </a:theme>
+</file>
+
+<file path=customXml/item1.xml><?xml version="1.0" encoding="utf-8"?>
+<b:Sources xmlns:b="http://schemas.openxmlformats.org/officeDocument/2006/bibliography" xmlns="http://schemas.openxmlformats.org/officeDocument/2006/bibliography" SelectedStyle="\APASixthEditionOfficeOnline.xsl" StyleName="APA" Version="6"/>
+</file>
+
+<file path=customXml/itemProps1.xml><?xml version="1.0" encoding="utf-8"?>
+<ds:datastoreItem xmlns:ds="http://schemas.openxmlformats.org/officeDocument/2006/customXml" ds:itemID="{605B9859-CA31-4F6D-BD40-BEB41CE2EB3F}">
+  <ds:schemaRefs>
+    <ds:schemaRef ds:uri="http://schemas.openxmlformats.org/officeDocument/2006/bibliography"/>
+  </ds:schemaRefs>
+</ds:datastoreItem>
 </file>
</xml_diff>